<commit_message>
Add terminal command screenshots to report
</commit_message>
<xml_diff>
--- a/ЛР2_2026.docx
+++ b/ЛР2_2026.docx
@@ -564,78 +564,24 @@
         </w:rPr>
         <w:t>«Разработка динамической библиотеки операций</w:t>
       </w:r>
-      <w:r>
+    </w:p>
+    <w:p>
+      <w:pPr>
+        <w:pStyle w:val="p1"/>
+        <w:jc w:val="center"/>
         <w:rPr>
           <w:b/>
           <w:sz w:val="32"/>
           <w:szCs w:val="32"/>
         </w:rPr>
-      </w:r>
+      </w:pPr>
       <w:r>
         <w:rPr>
           <w:b/>
           <w:sz w:val="32"/>
           <w:szCs w:val="32"/>
-          <w:lang w:val="en-US"/>
-        </w:rPr>
-      </w:r>
-      <w:r>
-        <w:rPr>
-          <w:b/>
-          <w:sz w:val="32"/>
-          <w:szCs w:val="32"/>
-        </w:rPr>
-      </w:r>
-    </w:p>
-    <w:p>
-      <w:pPr>
-        <w:pStyle w:val="p1"/>
-        <w:jc w:val="center"/>
-        <w:rPr>
-          <w:b/>
-          <w:sz w:val="32"/>
-          <w:szCs w:val="32"/>
-        </w:rPr>
-      </w:pPr>
-      <w:r>
-        <w:rPr>
-          <w:b/>
-          <w:sz w:val="32"/>
-          <w:szCs w:val="32"/>
         </w:rPr>
         <w:t>над массивами»</w:t>
-      </w:r>
-      <w:proofErr w:type="spellStart"/>
-      <w:r>
-        <w:rPr>
-          <w:b/>
-          <w:sz w:val="32"/>
-          <w:szCs w:val="32"/>
-        </w:rPr>
-      </w:r>
-      <w:proofErr w:type="spellEnd"/>
-      <w:r>
-        <w:rPr>
-          <w:b/>
-          <w:sz w:val="32"/>
-          <w:szCs w:val="32"/>
-        </w:rPr>
-      </w:r>
-      <w:proofErr w:type="spellStart"/>
-      <w:r>
-        <w:rPr>
-          <w:b/>
-          <w:sz w:val="32"/>
-          <w:szCs w:val="32"/>
-        </w:rPr>
-      </w:r>
-      <w:proofErr w:type="spellEnd"/>
-      <w:r>
-        <w:rPr>
-          <w:b/>
-          <w:sz w:val="32"/>
-          <w:szCs w:val="32"/>
-        </w:rPr>
       </w:r>
     </w:p>
     <w:p>
@@ -665,21 +611,6 @@
           <w:szCs w:val="28"/>
         </w:rPr>
         <w:t>ДИСЦИПЛИНА: «Алгоритмизация и программирование»</w:t>
-      </w:r>
-      <w:r>
-        <w:rPr>
-          <w:b/>
-          <w:color w:val="000000"/>
-          <w:sz w:val="28"/>
-          <w:szCs w:val="28"/>
-        </w:rPr>
-      </w:r>
-      <w:r>
-        <w:rPr>
-          <w:b/>
-          <w:sz w:val="28"/>
-          <w:szCs w:val="28"/>
-        </w:rPr>
       </w:r>
     </w:p>
     <w:p>
@@ -1411,44 +1342,29 @@
         </w:rPr>
         <w:t>2026 г.</w:t>
       </w:r>
-      <w:r>
-        <w:rPr>
-          <w:sz w:val="28"/>
-          <w:szCs w:val="28"/>
-        </w:rPr>
-      </w:r>
-      <w:r>
-        <w:rPr>
-          <w:sz w:val="28"/>
-          <w:szCs w:val="28"/>
-        </w:rPr>
-      </w:r>
     </w:p>
     <w:p>
       <w:pPr>
         <w:keepNext/>
         <w:spacing w:before="200" w:after="120" w:line="276" w:lineRule="auto"/>
-        <w:ind w:firstLine="0"/>
-        <w:jc w:val="left"/>
-      </w:pPr>
-      <w:r>
-        <w:rPr>
-          <w:rFonts w:ascii="Times New Roman" w:hAnsi="Times New Roman" w:eastAsia="Times New Roman"/>
+      </w:pPr>
+      <w:r>
+        <w:rPr>
           <w:b/>
           <w:sz w:val="32"/>
         </w:rPr>
+        <w:lastRenderedPageBreak/>
         <w:t>Цель работы</w:t>
       </w:r>
     </w:p>
     <w:p>
       <w:pPr>
-        <w:spacing w:line="360" w:lineRule="auto" w:after="0"/>
+        <w:spacing w:line="360" w:lineRule="auto"/>
         <w:ind w:firstLine="709"/>
         <w:jc w:val="both"/>
       </w:pPr>
       <w:r>
         <w:rPr>
-          <w:rFonts w:ascii="Times New Roman" w:hAnsi="Times New Roman" w:eastAsia="Times New Roman"/>
           <w:sz w:val="28"/>
         </w:rPr>
         <w:t>Разработать кроссплатформенную динамическую библиотеку для вычислений над массивами целых чисел и проверить её работу на примере курса валюты.</w:t>
@@ -1458,12 +1374,9 @@
       <w:pPr>
         <w:keepNext/>
         <w:spacing w:before="200" w:after="120" w:line="276" w:lineRule="auto"/>
-        <w:ind w:firstLine="0"/>
-        <w:jc w:val="left"/>
-      </w:pPr>
-      <w:r>
-        <w:rPr>
-          <w:rFonts w:ascii="Times New Roman" w:hAnsi="Times New Roman" w:eastAsia="Times New Roman"/>
+      </w:pPr>
+      <w:r>
+        <w:rPr>
           <w:b/>
           <w:sz w:val="32"/>
         </w:rPr>
@@ -1478,17 +1391,9 @@
       </w:pPr>
       <w:r>
         <w:rPr>
-          <w:rFonts w:ascii="Times New Roman" w:hAnsi="Times New Roman" w:eastAsia="Times New Roman"/>
           <w:sz w:val="28"/>
         </w:rPr>
-        <w:t xml:space="preserve">– </w:t>
-      </w:r>
-      <w:r>
-        <w:rPr>
-          <w:rFonts w:ascii="Times New Roman" w:hAnsi="Times New Roman" w:eastAsia="Times New Roman"/>
-          <w:sz w:val="28"/>
-        </w:rPr>
-        <w:t>разделить программу на заголовочный файл, файл реализации и программы, которые используют библиотеку;</w:t>
+        <w:t>– разделить программу на заголовочный файл, файл реализации и программы, которые используют библиотеку;</w:t>
       </w:r>
     </w:p>
     <w:p>
@@ -1499,17 +1404,9 @@
       </w:pPr>
       <w:r>
         <w:rPr>
-          <w:rFonts w:ascii="Times New Roman" w:hAnsi="Times New Roman" w:eastAsia="Times New Roman"/>
           <w:sz w:val="28"/>
         </w:rPr>
-        <w:t xml:space="preserve">– </w:t>
-      </w:r>
-      <w:r>
-        <w:rPr>
-          <w:rFonts w:ascii="Times New Roman" w:hAnsi="Times New Roman" w:eastAsia="Times New Roman"/>
-          <w:sz w:val="28"/>
-        </w:rPr>
-        <w:t>реализовать функции для вычисления суммы, минимума, максимума, среднего, медианы, произведения и количества положительных, отрицательных и нулевых элементов;</w:t>
+        <w:t>– реализовать функции для вычисления суммы, минимума, максимума, среднего, медианы, произведения и количества положительных, отрицательных и нулевых элементов;</w:t>
       </w:r>
     </w:p>
     <w:p>
@@ -1520,17 +1417,9 @@
       </w:pPr>
       <w:r>
         <w:rPr>
-          <w:rFonts w:ascii="Times New Roman" w:hAnsi="Times New Roman" w:eastAsia="Times New Roman"/>
           <w:sz w:val="28"/>
         </w:rPr>
-        <w:t xml:space="preserve">– </w:t>
-      </w:r>
-      <w:r>
-        <w:rPr>
-          <w:rFonts w:ascii="Times New Roman" w:hAnsi="Times New Roman" w:eastAsia="Times New Roman"/>
-          <w:sz w:val="28"/>
-        </w:rPr>
-        <w:t>собрать статическую и динамическую библиотеки с помощью CMake;</w:t>
+        <w:t>– собрать статическую и динамическую библиотеки с помощью CMake;</w:t>
       </w:r>
     </w:p>
     <w:p>
@@ -1541,17 +1430,9 @@
       </w:pPr>
       <w:r>
         <w:rPr>
-          <w:rFonts w:ascii="Times New Roman" w:hAnsi="Times New Roman" w:eastAsia="Times New Roman"/>
           <w:sz w:val="28"/>
         </w:rPr>
-        <w:t xml:space="preserve">– </w:t>
-      </w:r>
-      <w:r>
-        <w:rPr>
-          <w:rFonts w:ascii="Times New Roman" w:hAnsi="Times New Roman" w:eastAsia="Times New Roman"/>
-          <w:sz w:val="28"/>
-        </w:rPr>
-        <w:t>подготовить программу варианта 21 и проверить её unit- и интеграционными тестами;</w:t>
+        <w:t>– подготовить программу варианта 21 и проверить её unit- и интеграционными тестами;</w:t>
       </w:r>
     </w:p>
     <w:p>
@@ -1562,17 +1443,9 @@
       </w:pPr>
       <w:r>
         <w:rPr>
-          <w:rFonts w:ascii="Times New Roman" w:hAnsi="Times New Roman" w:eastAsia="Times New Roman"/>
           <w:sz w:val="28"/>
         </w:rPr>
-        <w:t xml:space="preserve">– </w:t>
-      </w:r>
-      <w:r>
-        <w:rPr>
-          <w:rFonts w:ascii="Times New Roman" w:hAnsi="Times New Roman" w:eastAsia="Times New Roman"/>
-          <w:sz w:val="28"/>
-        </w:rPr>
-        <w:t>создать репозиторий Git с историей изменений, веткой разработки и тегом версии.</w:t>
+        <w:t>– создать репозиторий Git с историей изменений, веткой разработки и тегом версии.</w:t>
       </w:r>
     </w:p>
     <w:p>
@@ -1580,27 +1453,24 @@
         <w:keepNext/>
         <w:pageBreakBefore/>
         <w:spacing w:before="200" w:after="120" w:line="276" w:lineRule="auto"/>
-        <w:ind w:firstLine="0"/>
-        <w:jc w:val="left"/>
-      </w:pPr>
-      <w:r>
-        <w:rPr>
-          <w:rFonts w:ascii="Times New Roman" w:hAnsi="Times New Roman" w:eastAsia="Times New Roman"/>
+      </w:pPr>
+      <w:r>
+        <w:rPr>
           <w:b/>
           <w:sz w:val="32"/>
         </w:rPr>
+        <w:lastRenderedPageBreak/>
         <w:t>Структура проекта и функции библиотеки</w:t>
       </w:r>
     </w:p>
     <w:p>
       <w:pPr>
-        <w:spacing w:line="360" w:lineRule="auto" w:after="0"/>
+        <w:spacing w:line="360" w:lineRule="auto"/>
         <w:ind w:firstLine="709"/>
         <w:jc w:val="both"/>
       </w:pPr>
       <w:r>
         <w:rPr>
-          <w:rFonts w:ascii="Times New Roman" w:hAnsi="Times New Roman" w:eastAsia="Times New Roman"/>
           <w:sz w:val="28"/>
         </w:rPr>
         <w:t>Код разделён на три основные части. В файле arraylib.h находятся объявления функций. Их реализация размещена в src/arraylib.cpp. Файл main.cpp показывает, как вызвать библиотеку, а examples/variant_21.cpp решает прикладную задачу по варианту.</w:t>
@@ -1609,13 +1479,10 @@
     <w:p>
       <w:pPr>
         <w:keepNext/>
-        <w:spacing w:before="80" w:after="60" w:line="240" w:lineRule="auto"/>
-        <w:ind w:firstLine="0"/>
-        <w:jc w:val="left"/>
-      </w:pPr>
-      <w:r>
-        <w:rPr>
-          <w:rFonts w:ascii="Times New Roman" w:hAnsi="Times New Roman" w:eastAsia="Times New Roman"/>
+        <w:spacing w:before="80" w:after="60"/>
+      </w:pPr>
+      <w:r>
+        <w:rPr>
           <w:sz w:val="24"/>
         </w:rPr>
         <w:t>Таблица 1 — Основные файлы проекта</w:t>
@@ -1624,33 +1491,31 @@
     <w:tbl>
       <w:tblPr>
         <w:tblStyle w:val="ab"/>
-        <w:tblW w:type="auto" w:w="0"/>
+        <w:tblW w:w="0" w:type="auto"/>
         <w:jc w:val="center"/>
-        <w:tblLook w:firstColumn="1" w:firstRow="1" w:lastColumn="0" w:lastRow="0" w:noHBand="0" w:noVBand="1" w:val="04A0"/>
+        <w:tblLook w:val="04A0" w:firstRow="1" w:lastRow="0" w:firstColumn="1" w:lastColumn="0" w:noHBand="0" w:noVBand="1"/>
       </w:tblPr>
       <w:tblGrid>
-        <w:gridCol w:w="4960"/>
-        <w:gridCol w:w="4960"/>
+        <w:gridCol w:w="3061"/>
+        <w:gridCol w:w="5896"/>
       </w:tblGrid>
       <w:tr>
         <w:trPr>
-          <w:tblHeader w:val="true"/>
           <w:cantSplit/>
+          <w:tblHeader/>
+          <w:jc w:val="center"/>
         </w:trPr>
         <w:tc>
           <w:tcPr>
-            <w:tcW w:type="dxa" w:w="3061"/>
+            <w:tcW w:w="3061" w:type="dxa"/>
             <w:vAlign w:val="center"/>
           </w:tcPr>
           <w:p>
             <w:pPr>
-              <w:spacing w:line="240" w:lineRule="auto"/>
-              <w:ind w:firstLine="0"/>
               <w:jc w:val="center"/>
             </w:pPr>
             <w:r>
               <w:rPr>
-                <w:rFonts w:ascii="Times New Roman" w:hAnsi="Times New Roman" w:eastAsia="Times New Roman"/>
                 <w:b/>
                 <w:sz w:val="22"/>
               </w:rPr>
@@ -1660,18 +1525,15 @@
         </w:tc>
         <w:tc>
           <w:tcPr>
-            <w:tcW w:type="dxa" w:w="5896"/>
+            <w:tcW w:w="5896" w:type="dxa"/>
             <w:vAlign w:val="center"/>
           </w:tcPr>
           <w:p>
             <w:pPr>
-              <w:spacing w:line="240" w:lineRule="auto"/>
-              <w:ind w:firstLine="0"/>
               <w:jc w:val="center"/>
             </w:pPr>
             <w:r>
               <w:rPr>
-                <w:rFonts w:ascii="Times New Roman" w:hAnsi="Times New Roman" w:eastAsia="Times New Roman"/>
                 <w:b/>
                 <w:sz w:val="22"/>
               </w:rPr>
@@ -1683,21 +1545,16 @@
       <w:tr>
         <w:trPr>
           <w:cantSplit/>
+          <w:jc w:val="center"/>
         </w:trPr>
         <w:tc>
           <w:tcPr>
-            <w:tcW w:type="dxa" w:w="3061"/>
+            <w:tcW w:w="3061" w:type="dxa"/>
             <w:vAlign w:val="center"/>
           </w:tcPr>
           <w:p>
-            <w:pPr>
-              <w:spacing w:line="240" w:lineRule="auto"/>
-              <w:ind w:firstLine="0"/>
-              <w:jc w:val="left"/>
-            </w:pPr>
             <w:r>
               <w:rPr>
-                <w:rFonts w:ascii="Times New Roman" w:hAnsi="Times New Roman" w:eastAsia="Times New Roman"/>
                 <w:sz w:val="22"/>
               </w:rPr>
               <w:t>include/arraylib.h</w:t>
@@ -1706,18 +1563,15 @@
         </w:tc>
         <w:tc>
           <w:tcPr>
-            <w:tcW w:type="dxa" w:w="5896"/>
+            <w:tcW w:w="5896" w:type="dxa"/>
             <w:vAlign w:val="center"/>
           </w:tcPr>
           <w:p>
             <w:pPr>
-              <w:spacing w:line="240" w:lineRule="auto"/>
-              <w:ind w:firstLine="0"/>
               <w:jc w:val="center"/>
             </w:pPr>
             <w:r>
               <w:rPr>
-                <w:rFonts w:ascii="Times New Roman" w:hAnsi="Times New Roman" w:eastAsia="Times New Roman"/>
                 <w:sz w:val="22"/>
               </w:rPr>
               <w:t>Объявления функций и тип размера std::size_t.</w:t>
@@ -1728,21 +1582,16 @@
       <w:tr>
         <w:trPr>
           <w:cantSplit/>
+          <w:jc w:val="center"/>
         </w:trPr>
         <w:tc>
           <w:tcPr>
-            <w:tcW w:type="dxa" w:w="3061"/>
+            <w:tcW w:w="3061" w:type="dxa"/>
             <w:vAlign w:val="center"/>
           </w:tcPr>
           <w:p>
-            <w:pPr>
-              <w:spacing w:line="240" w:lineRule="auto"/>
-              <w:ind w:firstLine="0"/>
-              <w:jc w:val="left"/>
-            </w:pPr>
             <w:r>
               <w:rPr>
-                <w:rFonts w:ascii="Times New Roman" w:hAnsi="Times New Roman" w:eastAsia="Times New Roman"/>
                 <w:sz w:val="22"/>
               </w:rPr>
               <w:t>src/arraylib.cpp</w:t>
@@ -1751,18 +1600,15 @@
         </w:tc>
         <w:tc>
           <w:tcPr>
-            <w:tcW w:type="dxa" w:w="5896"/>
+            <w:tcW w:w="5896" w:type="dxa"/>
             <w:vAlign w:val="center"/>
           </w:tcPr>
           <w:p>
             <w:pPr>
-              <w:spacing w:line="240" w:lineRule="auto"/>
-              <w:ind w:firstLine="0"/>
               <w:jc w:val="center"/>
             </w:pPr>
             <w:r>
               <w:rPr>
-                <w:rFonts w:ascii="Times New Roman" w:hAnsi="Times New Roman" w:eastAsia="Times New Roman"/>
                 <w:sz w:val="22"/>
               </w:rPr>
               <w:t>Реализация операций над массивом.</w:t>
@@ -1773,21 +1619,16 @@
       <w:tr>
         <w:trPr>
           <w:cantSplit/>
+          <w:jc w:val="center"/>
         </w:trPr>
         <w:tc>
           <w:tcPr>
-            <w:tcW w:type="dxa" w:w="3061"/>
+            <w:tcW w:w="3061" w:type="dxa"/>
             <w:vAlign w:val="center"/>
           </w:tcPr>
           <w:p>
-            <w:pPr>
-              <w:spacing w:line="240" w:lineRule="auto"/>
-              <w:ind w:firstLine="0"/>
-              <w:jc w:val="left"/>
-            </w:pPr>
             <w:r>
               <w:rPr>
-                <w:rFonts w:ascii="Times New Roman" w:hAnsi="Times New Roman" w:eastAsia="Times New Roman"/>
                 <w:sz w:val="22"/>
               </w:rPr>
               <w:t>examples/variant_21.cpp</w:t>
@@ -1796,18 +1637,15 @@
         </w:tc>
         <w:tc>
           <w:tcPr>
-            <w:tcW w:type="dxa" w:w="5896"/>
+            <w:tcW w:w="5896" w:type="dxa"/>
             <w:vAlign w:val="center"/>
           </w:tcPr>
           <w:p>
             <w:pPr>
-              <w:spacing w:line="240" w:lineRule="auto"/>
-              <w:ind w:firstLine="0"/>
               <w:jc w:val="center"/>
             </w:pPr>
             <w:r>
               <w:rPr>
-                <w:rFonts w:ascii="Times New Roman" w:hAnsi="Times New Roman" w:eastAsia="Times New Roman"/>
                 <w:sz w:val="22"/>
               </w:rPr>
               <w:t>Демонстрационная программа курса валюты.</w:t>
@@ -1818,21 +1656,16 @@
       <w:tr>
         <w:trPr>
           <w:cantSplit/>
+          <w:jc w:val="center"/>
         </w:trPr>
         <w:tc>
           <w:tcPr>
-            <w:tcW w:type="dxa" w:w="3061"/>
+            <w:tcW w:w="3061" w:type="dxa"/>
             <w:vAlign w:val="center"/>
           </w:tcPr>
           <w:p>
-            <w:pPr>
-              <w:spacing w:line="240" w:lineRule="auto"/>
-              <w:ind w:firstLine="0"/>
-              <w:jc w:val="left"/>
-            </w:pPr>
             <w:r>
               <w:rPr>
-                <w:rFonts w:ascii="Times New Roman" w:hAnsi="Times New Roman" w:eastAsia="Times New Roman"/>
                 <w:sz w:val="22"/>
               </w:rPr>
               <w:t>tests/</w:t>
@@ -1841,18 +1674,15 @@
         </w:tc>
         <w:tc>
           <w:tcPr>
-            <w:tcW w:type="dxa" w:w="5896"/>
+            <w:tcW w:w="5896" w:type="dxa"/>
             <w:vAlign w:val="center"/>
           </w:tcPr>
           <w:p>
             <w:pPr>
-              <w:spacing w:line="240" w:lineRule="auto"/>
-              <w:ind w:firstLine="0"/>
               <w:jc w:val="center"/>
             </w:pPr>
             <w:r>
               <w:rPr>
-                <w:rFonts w:ascii="Times New Roman" w:hAnsi="Times New Roman" w:eastAsia="Times New Roman"/>
                 <w:sz w:val="22"/>
               </w:rPr>
               <w:t>Модульные и интеграционные проверки.</w:t>
@@ -1863,21 +1693,16 @@
       <w:tr>
         <w:trPr>
           <w:cantSplit/>
+          <w:jc w:val="center"/>
         </w:trPr>
         <w:tc>
           <w:tcPr>
-            <w:tcW w:type="dxa" w:w="3061"/>
+            <w:tcW w:w="3061" w:type="dxa"/>
             <w:vAlign w:val="center"/>
           </w:tcPr>
           <w:p>
-            <w:pPr>
-              <w:spacing w:line="240" w:lineRule="auto"/>
-              <w:ind w:firstLine="0"/>
-              <w:jc w:val="left"/>
-            </w:pPr>
             <w:r>
               <w:rPr>
-                <w:rFonts w:ascii="Times New Roman" w:hAnsi="Times New Roman" w:eastAsia="Times New Roman"/>
                 <w:sz w:val="22"/>
               </w:rPr>
               <w:t>CMakeLists.txt</w:t>
@@ -1886,18 +1711,15 @@
         </w:tc>
         <w:tc>
           <w:tcPr>
-            <w:tcW w:type="dxa" w:w="5896"/>
+            <w:tcW w:w="5896" w:type="dxa"/>
             <w:vAlign w:val="center"/>
           </w:tcPr>
           <w:p>
             <w:pPr>
-              <w:spacing w:line="240" w:lineRule="auto"/>
-              <w:ind w:firstLine="0"/>
               <w:jc w:val="center"/>
             </w:pPr>
             <w:r>
               <w:rPr>
-                <w:rFonts w:ascii="Times New Roman" w:hAnsi="Times New Roman" w:eastAsia="Times New Roman"/>
                 <w:sz w:val="22"/>
               </w:rPr>
               <w:t>Настройка сборки библиотек, программ и тестов.</w:t>
@@ -1909,8 +1731,7 @@
     <w:p>
       <w:pPr>
         <w:keepLines/>
-        <w:spacing w:line="240" w:lineRule="auto" w:before="0" w:after="80"/>
-        <w:ind w:firstLine="0"/>
+        <w:spacing w:after="80"/>
       </w:pPr>
       <w:r>
         <w:rPr>
@@ -1921,13 +1742,12 @@
     </w:p>
     <w:p>
       <w:pPr>
-        <w:spacing w:line="360" w:lineRule="auto" w:after="0"/>
+        <w:spacing w:line="360" w:lineRule="auto"/>
         <w:ind w:firstLine="709"/>
         <w:jc w:val="both"/>
       </w:pPr>
       <w:r>
         <w:rPr>
-          <w:rFonts w:ascii="Times New Roman" w:hAnsi="Times New Roman" w:eastAsia="Times New Roman"/>
           <w:sz w:val="28"/>
         </w:rPr>
         <w:t>Размер массива передаётся отдельным аргументом типа std::size_t. В работе используются непустые массивы. Для суммы и произведения методические указания не задают отдельную проверку переполнения типа int, поэтому в программе предполагается, что результат помещается в int [1].</w:t>
@@ -1935,13 +1755,12 @@
     </w:p>
     <w:p>
       <w:pPr>
-        <w:spacing w:line="360" w:lineRule="auto" w:after="0"/>
+        <w:spacing w:line="360" w:lineRule="auto"/>
         <w:ind w:firstLine="709"/>
         <w:jc w:val="both"/>
       </w:pPr>
       <w:r>
         <w:rPr>
-          <w:rFonts w:ascii="Times New Roman" w:hAnsi="Times New Roman" w:eastAsia="Times New Roman"/>
           <w:sz w:val="28"/>
         </w:rPr>
         <w:t>Среднее вычисляется как сумма, делённая на количество элементов. Чтобы получить медиану, функция копирует массив во временный вектор, сортирует его и берёт центральное значение. Если элементов чётное число, функция усредняет два центральных значения. Исходный массив при этом остаётся прежним.</w:t>
@@ -1950,79 +1769,153 @@
     <w:p>
       <w:pPr>
         <w:keepNext/>
-        <w:spacing w:before="80" w:after="60" w:line="240" w:lineRule="auto"/>
-        <w:ind w:firstLine="0"/>
-        <w:jc w:val="left"/>
-      </w:pPr>
-      <w:r>
-        <w:rPr>
-          <w:rFonts w:ascii="Times New Roman" w:hAnsi="Times New Roman" w:eastAsia="Times New Roman"/>
-          <w:sz w:val="24"/>
-        </w:rPr>
-        <w:t>Листинг 1 — Основная часть вычисления медианы</w:t>
+        <w:spacing w:before="80" w:after="60"/>
+        <w:rPr>
+          <w:lang w:val="en-US"/>
+        </w:rPr>
+      </w:pPr>
+      <w:r>
+        <w:rPr>
+          <w:sz w:val="24"/>
+        </w:rPr>
+        <w:t>Листинг</w:t>
+      </w:r>
+      <w:r>
+        <w:rPr>
+          <w:sz w:val="24"/>
+          <w:lang w:val="en-US"/>
+        </w:rPr>
+        <w:t xml:space="preserve"> 1 — </w:t>
+      </w:r>
+      <w:r>
+        <w:rPr>
+          <w:sz w:val="24"/>
+        </w:rPr>
+        <w:t>Основная</w:t>
+      </w:r>
+      <w:r>
+        <w:rPr>
+          <w:sz w:val="24"/>
+          <w:lang w:val="en-US"/>
+        </w:rPr>
+        <w:t xml:space="preserve"> </w:t>
+      </w:r>
+      <w:r>
+        <w:rPr>
+          <w:sz w:val="24"/>
+        </w:rPr>
+        <w:t>часть</w:t>
+      </w:r>
+      <w:r>
+        <w:rPr>
+          <w:sz w:val="24"/>
+          <w:lang w:val="en-US"/>
+        </w:rPr>
+        <w:t xml:space="preserve"> </w:t>
+      </w:r>
+      <w:r>
+        <w:rPr>
+          <w:sz w:val="24"/>
+        </w:rPr>
+        <w:t>вычисления</w:t>
+      </w:r>
+      <w:r>
+        <w:rPr>
+          <w:sz w:val="24"/>
+          <w:lang w:val="en-US"/>
+        </w:rPr>
+        <w:t xml:space="preserve"> </w:t>
+      </w:r>
+      <w:r>
+        <w:rPr>
+          <w:sz w:val="24"/>
+        </w:rPr>
+        <w:t>медианы</w:t>
       </w:r>
     </w:p>
     <w:p>
       <w:pPr>
         <w:keepLines/>
-        <w:spacing w:line="240" w:lineRule="auto" w:before="0" w:after="0"/>
-        <w:ind w:firstLine="0" w:left="454"/>
-        <w:jc w:val="left"/>
-      </w:pPr>
-      <w:r>
-        <w:rPr>
-          <w:rFonts w:ascii="Courier New" w:hAnsi="Courier New" w:eastAsia="Courier New"/>
-          <w:sz w:val="24"/>
+        <w:ind w:left="454"/>
+        <w:rPr>
+          <w:lang w:val="en-US"/>
+        </w:rPr>
+      </w:pPr>
+      <w:r>
+        <w:rPr>
+          <w:rFonts w:ascii="Courier New" w:eastAsia="Courier New" w:hAnsi="Courier New"/>
+          <w:sz w:val="24"/>
+          <w:lang w:val="en-US"/>
         </w:rPr>
         <w:t>std::vector&lt;int&gt; sorted(arr, arr + n);</w:t>
       </w:r>
       <w:r>
+        <w:rPr>
+          <w:lang w:val="en-US"/>
+        </w:rPr>
         <w:br/>
       </w:r>
       <w:r>
         <w:rPr>
-          <w:rFonts w:ascii="Courier New" w:hAnsi="Courier New" w:eastAsia="Courier New"/>
-          <w:sz w:val="24"/>
+          <w:rFonts w:ascii="Courier New" w:eastAsia="Courier New" w:hAnsi="Courier New"/>
+          <w:sz w:val="24"/>
+          <w:lang w:val="en-US"/>
         </w:rPr>
         <w:t>std::sort(sorted.begin(), sorted.end());</w:t>
       </w:r>
       <w:r>
+        <w:rPr>
+          <w:lang w:val="en-US"/>
+        </w:rPr>
         <w:br/>
       </w:r>
       <w:r>
         <w:rPr>
-          <w:rFonts w:ascii="Courier New" w:hAnsi="Courier New" w:eastAsia="Courier New"/>
-          <w:sz w:val="24"/>
+          <w:rFonts w:ascii="Courier New" w:eastAsia="Courier New" w:hAnsi="Courier New"/>
+          <w:sz w:val="24"/>
+          <w:lang w:val="en-US"/>
         </w:rPr>
         <w:t>const std::size_t middle = n / 2;</w:t>
       </w:r>
       <w:r>
+        <w:rPr>
+          <w:lang w:val="en-US"/>
+        </w:rPr>
         <w:br/>
       </w:r>
       <w:r>
         <w:rPr>
-          <w:rFonts w:ascii="Courier New" w:hAnsi="Courier New" w:eastAsia="Courier New"/>
-          <w:sz w:val="24"/>
+          <w:rFonts w:ascii="Courier New" w:eastAsia="Courier New" w:hAnsi="Courier New"/>
+          <w:sz w:val="24"/>
+          <w:lang w:val="en-US"/>
         </w:rPr>
         <w:t>if (n % 2 != 0) return sorted[middle];</w:t>
       </w:r>
       <w:r>
+        <w:rPr>
+          <w:lang w:val="en-US"/>
+        </w:rPr>
         <w:br/>
       </w:r>
       <w:r>
         <w:rPr>
-          <w:rFonts w:ascii="Courier New" w:hAnsi="Courier New" w:eastAsia="Courier New"/>
-          <w:sz w:val="24"/>
+          <w:rFonts w:ascii="Courier New" w:eastAsia="Courier New" w:hAnsi="Courier New"/>
+          <w:sz w:val="24"/>
+          <w:lang w:val="en-US"/>
         </w:rPr>
         <w:t>return (static_cast&lt;double&gt;(sorted[middle - 1]) +</w:t>
       </w:r>
       <w:r>
+        <w:rPr>
+          <w:lang w:val="en-US"/>
+        </w:rPr>
         <w:br/>
       </w:r>
       <w:r>
         <w:rPr>
-          <w:rFonts w:ascii="Courier New" w:hAnsi="Courier New" w:eastAsia="Courier New"/>
-          <w:sz w:val="24"/>
+          <w:rFonts w:ascii="Courier New" w:eastAsia="Courier New" w:hAnsi="Courier New"/>
+          <w:sz w:val="24"/>
+          <w:lang w:val="en-US"/>
         </w:rPr>
         <w:t xml:space="preserve">        sorted[middle]) / 2.0;</w:t>
       </w:r>
@@ -2032,27 +1925,24 @@
         <w:keepNext/>
         <w:pageBreakBefore/>
         <w:spacing w:before="200" w:after="120" w:line="276" w:lineRule="auto"/>
-        <w:ind w:firstLine="0"/>
-        <w:jc w:val="left"/>
-      </w:pPr>
-      <w:r>
-        <w:rPr>
-          <w:rFonts w:ascii="Times New Roman" w:hAnsi="Times New Roman" w:eastAsia="Times New Roman"/>
+      </w:pPr>
+      <w:r>
+        <w:rPr>
           <w:b/>
           <w:sz w:val="32"/>
         </w:rPr>
+        <w:lastRenderedPageBreak/>
         <w:t>Сборка библиотек и программ</w:t>
       </w:r>
     </w:p>
     <w:p>
       <w:pPr>
-        <w:spacing w:line="360" w:lineRule="auto" w:after="0"/>
+        <w:spacing w:line="360" w:lineRule="auto"/>
         <w:ind w:firstLine="709"/>
         <w:jc w:val="both"/>
       </w:pPr>
       <w:r>
         <w:rPr>
-          <w:rFonts w:ascii="Times New Roman" w:hAnsi="Times New Roman" w:eastAsia="Times New Roman"/>
           <w:sz w:val="28"/>
         </w:rPr>
         <w:t>В CMake заведены две цели библиотеки: arraylib_static для статической сборки и arraylib для динамической. Программа app и пример варианта связываются с динамической библиотекой. Unit-тест связан со статической библиотекой, а интеграционный тест проверяет работу через динамическую.</w:t>
@@ -2060,13 +1950,12 @@
     </w:p>
     <w:p>
       <w:pPr>
-        <w:spacing w:line="360" w:lineRule="auto" w:after="0"/>
+        <w:spacing w:line="360" w:lineRule="auto"/>
         <w:ind w:firstLine="709"/>
         <w:jc w:val="both"/>
       </w:pPr>
       <w:r>
         <w:rPr>
-          <w:rFonts w:ascii="Times New Roman" w:hAnsi="Times New Roman" w:eastAsia="Times New Roman"/>
           <w:sz w:val="28"/>
         </w:rPr>
         <w:t>После сборки на компьютере, где выполнялась работа, созданы файлы libarraylib.a и libarraylib.dylib, а также исполняемые файлы app и variant_21. В Linux динамическая цель получает расширение .so, а в Windows — .dll. На этих двух системах сборка в этой работе не запускалась.</w:t>
@@ -2075,72 +1964,137 @@
     <w:p>
       <w:pPr>
         <w:keepNext/>
-        <w:spacing w:before="80" w:after="60" w:line="240" w:lineRule="auto"/>
-        <w:ind w:firstLine="0"/>
-        <w:jc w:val="left"/>
-      </w:pPr>
-      <w:r>
-        <w:rPr>
-          <w:rFonts w:ascii="Times New Roman" w:hAnsi="Times New Roman" w:eastAsia="Times New Roman"/>
-          <w:sz w:val="24"/>
-        </w:rPr>
-        <w:t>Листинг 2 — Команды сборки и запуска</w:t>
+        <w:spacing w:before="80" w:after="60"/>
+        <w:rPr>
+          <w:lang w:val="en-US"/>
+        </w:rPr>
+      </w:pPr>
+      <w:r>
+        <w:rPr>
+          <w:sz w:val="24"/>
+        </w:rPr>
+        <w:t>Листинг</w:t>
+      </w:r>
+      <w:r>
+        <w:rPr>
+          <w:sz w:val="24"/>
+          <w:lang w:val="en-US"/>
+        </w:rPr>
+        <w:t xml:space="preserve"> 2 — </w:t>
+      </w:r>
+      <w:r>
+        <w:rPr>
+          <w:sz w:val="24"/>
+        </w:rPr>
+        <w:t>Команды</w:t>
+      </w:r>
+      <w:r>
+        <w:rPr>
+          <w:sz w:val="24"/>
+          <w:lang w:val="en-US"/>
+        </w:rPr>
+        <w:t xml:space="preserve"> </w:t>
+      </w:r>
+      <w:r>
+        <w:rPr>
+          <w:sz w:val="24"/>
+        </w:rPr>
+        <w:t>сборки</w:t>
+      </w:r>
+      <w:r>
+        <w:rPr>
+          <w:sz w:val="24"/>
+          <w:lang w:val="en-US"/>
+        </w:rPr>
+        <w:t xml:space="preserve"> </w:t>
+      </w:r>
+      <w:r>
+        <w:rPr>
+          <w:sz w:val="24"/>
+        </w:rPr>
+        <w:t>и</w:t>
+      </w:r>
+      <w:r>
+        <w:rPr>
+          <w:sz w:val="24"/>
+          <w:lang w:val="en-US"/>
+        </w:rPr>
+        <w:t xml:space="preserve"> </w:t>
+      </w:r>
+      <w:r>
+        <w:rPr>
+          <w:sz w:val="24"/>
+        </w:rPr>
+        <w:t>запуска</w:t>
       </w:r>
     </w:p>
     <w:p>
       <w:pPr>
         <w:keepLines/>
-        <w:spacing w:line="240" w:lineRule="auto" w:before="0" w:after="0"/>
-        <w:ind w:firstLine="0" w:left="454"/>
-        <w:jc w:val="left"/>
-      </w:pPr>
-      <w:r>
-        <w:rPr>
-          <w:rFonts w:ascii="Courier New" w:hAnsi="Courier New" w:eastAsia="Courier New"/>
-          <w:sz w:val="24"/>
+        <w:ind w:left="454"/>
+        <w:rPr>
+          <w:lang w:val="en-US"/>
+        </w:rPr>
+      </w:pPr>
+      <w:r>
+        <w:rPr>
+          <w:rFonts w:ascii="Courier New" w:eastAsia="Courier New" w:hAnsi="Courier New"/>
+          <w:sz w:val="24"/>
+          <w:lang w:val="en-US"/>
         </w:rPr>
         <w:t>cmake -S . -B build</w:t>
       </w:r>
       <w:r>
+        <w:rPr>
+          <w:lang w:val="en-US"/>
+        </w:rPr>
         <w:br/>
       </w:r>
       <w:r>
         <w:rPr>
-          <w:rFonts w:ascii="Courier New" w:hAnsi="Courier New" w:eastAsia="Courier New"/>
-          <w:sz w:val="24"/>
+          <w:rFonts w:ascii="Courier New" w:eastAsia="Courier New" w:hAnsi="Courier New"/>
+          <w:sz w:val="24"/>
+          <w:lang w:val="en-US"/>
         </w:rPr>
         <w:t>cmake --build build</w:t>
       </w:r>
       <w:r>
+        <w:rPr>
+          <w:lang w:val="en-US"/>
+        </w:rPr>
         <w:br/>
       </w:r>
       <w:r>
         <w:rPr>
-          <w:rFonts w:ascii="Courier New" w:hAnsi="Courier New" w:eastAsia="Courier New"/>
-          <w:sz w:val="24"/>
+          <w:rFonts w:ascii="Courier New" w:eastAsia="Courier New" w:hAnsi="Courier New"/>
+          <w:sz w:val="24"/>
+          <w:lang w:val="en-US"/>
         </w:rPr>
         <w:t>ctest --test-dir build --output-on-failure</w:t>
       </w:r>
       <w:r>
+        <w:rPr>
+          <w:lang w:val="en-US"/>
+        </w:rPr>
         <w:br/>
       </w:r>
       <w:r>
         <w:rPr>
-          <w:rFonts w:ascii="Courier New" w:hAnsi="Courier New" w:eastAsia="Courier New"/>
-          <w:sz w:val="24"/>
+          <w:rFonts w:ascii="Courier New" w:eastAsia="Courier New" w:hAnsi="Courier New"/>
+          <w:sz w:val="24"/>
+          <w:lang w:val="en-US"/>
         </w:rPr>
         <w:t>./build/variant_21</w:t>
       </w:r>
     </w:p>
     <w:p>
       <w:pPr>
-        <w:spacing w:line="360" w:lineRule="auto" w:after="0"/>
+        <w:spacing w:line="360" w:lineRule="auto"/>
         <w:ind w:firstLine="709"/>
         <w:jc w:val="both"/>
       </w:pPr>
       <w:r>
         <w:rPr>
-          <w:rFonts w:ascii="Times New Roman" w:hAnsi="Times New Roman" w:eastAsia="Times New Roman"/>
           <w:sz w:val="28"/>
         </w:rPr>
         <w:t>В CMake включены стандарт C++17 и предупреждения компилятора. Библиотека и исполняемые файлы размещаются в каталоге build. Динамическая библиотека находится рядом с программами, поэтому демонстратор можно запустить без дополнительной настройки пути поиска.</w:t>
@@ -2151,27 +2105,24 @@
         <w:keepNext/>
         <w:pageBreakBefore/>
         <w:spacing w:before="200" w:after="120" w:line="276" w:lineRule="auto"/>
-        <w:ind w:firstLine="0"/>
-        <w:jc w:val="left"/>
-      </w:pPr>
-      <w:r>
-        <w:rPr>
-          <w:rFonts w:ascii="Times New Roman" w:hAnsi="Times New Roman" w:eastAsia="Times New Roman"/>
+      </w:pPr>
+      <w:r>
+        <w:rPr>
           <w:b/>
           <w:sz w:val="32"/>
         </w:rPr>
+        <w:lastRenderedPageBreak/>
         <w:t>Решение варианта 21</w:t>
       </w:r>
     </w:p>
     <w:p>
       <w:pPr>
-        <w:spacing w:line="360" w:lineRule="auto" w:after="0"/>
+        <w:spacing w:line="360" w:lineRule="auto"/>
         <w:ind w:firstLine="709"/>
         <w:jc w:val="both"/>
       </w:pPr>
       <w:r>
         <w:rPr>
-          <w:rFonts w:ascii="Times New Roman" w:hAnsi="Times New Roman" w:eastAsia="Times New Roman"/>
           <w:sz w:val="28"/>
         </w:rPr>
         <w:t>Вариант посвящён курсу валюты за десять дней. Программа объявляет исходный массив, вычисляет его размер и вызывает функции минимума, максимума, среднего и медианы. Количество дней выше 93 считается отдельным циклом, потому что в библиотеке нет функции для подсчёта элементов, превышающих произвольное число.</w:t>
@@ -2180,79 +2131,134 @@
     <w:p>
       <w:pPr>
         <w:keepNext/>
-        <w:spacing w:before="80" w:after="60" w:line="240" w:lineRule="auto"/>
-        <w:ind w:firstLine="0"/>
-        <w:jc w:val="left"/>
-      </w:pPr>
-      <w:r>
-        <w:rPr>
-          <w:rFonts w:ascii="Times New Roman" w:hAnsi="Times New Roman" w:eastAsia="Times New Roman"/>
-          <w:sz w:val="24"/>
-        </w:rPr>
-        <w:t>Листинг 3 — Данные варианта 21</w:t>
+        <w:spacing w:before="80" w:after="60"/>
+        <w:rPr>
+          <w:lang w:val="en-US"/>
+        </w:rPr>
+      </w:pPr>
+      <w:r>
+        <w:rPr>
+          <w:sz w:val="24"/>
+        </w:rPr>
+        <w:t>Листинг</w:t>
+      </w:r>
+      <w:r>
+        <w:rPr>
+          <w:sz w:val="24"/>
+          <w:lang w:val="en-US"/>
+        </w:rPr>
+        <w:t xml:space="preserve"> 3 — </w:t>
+      </w:r>
+      <w:r>
+        <w:rPr>
+          <w:sz w:val="24"/>
+        </w:rPr>
+        <w:t>Данные</w:t>
+      </w:r>
+      <w:r>
+        <w:rPr>
+          <w:sz w:val="24"/>
+          <w:lang w:val="en-US"/>
+        </w:rPr>
+        <w:t xml:space="preserve"> </w:t>
+      </w:r>
+      <w:r>
+        <w:rPr>
+          <w:sz w:val="24"/>
+        </w:rPr>
+        <w:t>варианта</w:t>
+      </w:r>
+      <w:r>
+        <w:rPr>
+          <w:sz w:val="24"/>
+          <w:lang w:val="en-US"/>
+        </w:rPr>
+        <w:t xml:space="preserve"> 21</w:t>
       </w:r>
     </w:p>
     <w:p>
       <w:pPr>
         <w:keepLines/>
-        <w:spacing w:line="240" w:lineRule="auto" w:before="0" w:after="0"/>
-        <w:ind w:firstLine="0" w:left="454"/>
-        <w:jc w:val="left"/>
-      </w:pPr>
-      <w:r>
-        <w:rPr>
-          <w:rFonts w:ascii="Courier New" w:hAnsi="Courier New" w:eastAsia="Courier New"/>
-          <w:sz w:val="24"/>
+        <w:ind w:left="454"/>
+        <w:rPr>
+          <w:lang w:val="en-US"/>
+        </w:rPr>
+      </w:pPr>
+      <w:r>
+        <w:rPr>
+          <w:rFonts w:ascii="Courier New" w:eastAsia="Courier New" w:hAnsi="Courier New"/>
+          <w:sz w:val="24"/>
+          <w:lang w:val="en-US"/>
         </w:rPr>
         <w:t>const int exchange_rate[] = {</w:t>
       </w:r>
       <w:r>
+        <w:rPr>
+          <w:lang w:val="en-US"/>
+        </w:rPr>
         <w:br/>
       </w:r>
       <w:r>
         <w:rPr>
-          <w:rFonts w:ascii="Courier New" w:hAnsi="Courier New" w:eastAsia="Courier New"/>
-          <w:sz w:val="24"/>
+          <w:rFonts w:ascii="Courier New" w:eastAsia="Courier New" w:hAnsi="Courier New"/>
+          <w:sz w:val="24"/>
+          <w:lang w:val="en-US"/>
         </w:rPr>
         <w:t xml:space="preserve">    91, 93, 92, 95, 94,</w:t>
       </w:r>
       <w:r>
+        <w:rPr>
+          <w:lang w:val="en-US"/>
+        </w:rPr>
         <w:br/>
       </w:r>
       <w:r>
         <w:rPr>
-          <w:rFonts w:ascii="Courier New" w:hAnsi="Courier New" w:eastAsia="Courier New"/>
-          <w:sz w:val="24"/>
+          <w:rFonts w:ascii="Courier New" w:eastAsia="Courier New" w:hAnsi="Courier New"/>
+          <w:sz w:val="24"/>
+          <w:lang w:val="en-US"/>
         </w:rPr>
         <w:t xml:space="preserve">    96, 90, 89, 94, 97</w:t>
       </w:r>
       <w:r>
+        <w:rPr>
+          <w:lang w:val="en-US"/>
+        </w:rPr>
         <w:br/>
       </w:r>
       <w:r>
         <w:rPr>
-          <w:rFonts w:ascii="Courier New" w:hAnsi="Courier New" w:eastAsia="Courier New"/>
-          <w:sz w:val="24"/>
+          <w:rFonts w:ascii="Courier New" w:eastAsia="Courier New" w:hAnsi="Courier New"/>
+          <w:sz w:val="24"/>
+          <w:lang w:val="en-US"/>
         </w:rPr>
         <w:t>};</w:t>
       </w:r>
       <w:r>
+        <w:rPr>
+          <w:lang w:val="en-US"/>
+        </w:rPr>
         <w:br/>
       </w:r>
       <w:r>
         <w:rPr>
-          <w:rFonts w:ascii="Courier New" w:hAnsi="Courier New" w:eastAsia="Courier New"/>
-          <w:sz w:val="24"/>
+          <w:rFonts w:ascii="Courier New" w:eastAsia="Courier New" w:hAnsi="Courier New"/>
+          <w:sz w:val="24"/>
+          <w:lang w:val="en-US"/>
         </w:rPr>
         <w:t>const std::size_t n =</w:t>
       </w:r>
       <w:r>
+        <w:rPr>
+          <w:lang w:val="en-US"/>
+        </w:rPr>
         <w:br/>
       </w:r>
       <w:r>
         <w:rPr>
-          <w:rFonts w:ascii="Courier New" w:hAnsi="Courier New" w:eastAsia="Courier New"/>
-          <w:sz w:val="24"/>
+          <w:rFonts w:ascii="Courier New" w:eastAsia="Courier New" w:hAnsi="Courier New"/>
+          <w:sz w:val="24"/>
+          <w:lang w:val="en-US"/>
         </w:rPr>
         <w:t xml:space="preserve">    sizeof(exchange_rate) / sizeof(exchange_rate[0]);</w:t>
       </w:r>
@@ -2260,13 +2266,10 @@
     <w:p>
       <w:pPr>
         <w:keepNext/>
-        <w:spacing w:before="80" w:after="60" w:line="240" w:lineRule="auto"/>
-        <w:ind w:firstLine="0"/>
-        <w:jc w:val="left"/>
-      </w:pPr>
-      <w:r>
-        <w:rPr>
-          <w:rFonts w:ascii="Times New Roman" w:hAnsi="Times New Roman" w:eastAsia="Times New Roman"/>
+        <w:spacing w:before="80" w:after="60"/>
+      </w:pPr>
+      <w:r>
+        <w:rPr>
           <w:sz w:val="24"/>
         </w:rPr>
         <w:t>Таблица 2 — Результаты обработки курса валюты</w:t>
@@ -2275,33 +2278,31 @@
     <w:tbl>
       <w:tblPr>
         <w:tblStyle w:val="ab"/>
-        <w:tblW w:type="auto" w:w="0"/>
+        <w:tblW w:w="0" w:type="auto"/>
         <w:jc w:val="center"/>
-        <w:tblLook w:firstColumn="1" w:firstRow="1" w:lastColumn="0" w:lastRow="0" w:noHBand="0" w:noVBand="1" w:val="04A0"/>
+        <w:tblLook w:val="04A0" w:firstRow="1" w:lastRow="0" w:firstColumn="1" w:lastColumn="0" w:noHBand="0" w:noVBand="1"/>
       </w:tblPr>
       <w:tblGrid>
-        <w:gridCol w:w="4960"/>
-        <w:gridCol w:w="4960"/>
+        <w:gridCol w:w="5669"/>
+        <w:gridCol w:w="3288"/>
       </w:tblGrid>
       <w:tr>
         <w:trPr>
-          <w:tblHeader w:val="true"/>
           <w:cantSplit/>
+          <w:tblHeader/>
+          <w:jc w:val="center"/>
         </w:trPr>
         <w:tc>
           <w:tcPr>
-            <w:tcW w:type="dxa" w:w="5669"/>
+            <w:tcW w:w="5669" w:type="dxa"/>
             <w:vAlign w:val="center"/>
           </w:tcPr>
           <w:p>
             <w:pPr>
-              <w:spacing w:line="240" w:lineRule="auto"/>
-              <w:ind w:firstLine="0"/>
               <w:jc w:val="center"/>
             </w:pPr>
             <w:r>
               <w:rPr>
-                <w:rFonts w:ascii="Times New Roman" w:hAnsi="Times New Roman" w:eastAsia="Times New Roman"/>
                 <w:b/>
                 <w:sz w:val="22"/>
               </w:rPr>
@@ -2311,18 +2312,15 @@
         </w:tc>
         <w:tc>
           <w:tcPr>
-            <w:tcW w:type="dxa" w:w="3288"/>
+            <w:tcW w:w="3288" w:type="dxa"/>
             <w:vAlign w:val="center"/>
           </w:tcPr>
           <w:p>
             <w:pPr>
-              <w:spacing w:line="240" w:lineRule="auto"/>
-              <w:ind w:firstLine="0"/>
               <w:jc w:val="center"/>
             </w:pPr>
             <w:r>
               <w:rPr>
-                <w:rFonts w:ascii="Times New Roman" w:hAnsi="Times New Roman" w:eastAsia="Times New Roman"/>
                 <w:b/>
                 <w:sz w:val="22"/>
               </w:rPr>
@@ -2334,21 +2332,16 @@
       <w:tr>
         <w:trPr>
           <w:cantSplit/>
+          <w:jc w:val="center"/>
         </w:trPr>
         <w:tc>
           <w:tcPr>
-            <w:tcW w:type="dxa" w:w="5669"/>
+            <w:tcW w:w="5669" w:type="dxa"/>
             <w:vAlign w:val="center"/>
           </w:tcPr>
           <w:p>
-            <w:pPr>
-              <w:spacing w:line="240" w:lineRule="auto"/>
-              <w:ind w:firstLine="0"/>
-              <w:jc w:val="left"/>
-            </w:pPr>
             <w:r>
               <w:rPr>
-                <w:rFonts w:ascii="Times New Roman" w:hAnsi="Times New Roman" w:eastAsia="Times New Roman"/>
                 <w:sz w:val="22"/>
               </w:rPr>
               <w:t>Количество дней</w:t>
@@ -2357,18 +2350,15 @@
         </w:tc>
         <w:tc>
           <w:tcPr>
-            <w:tcW w:type="dxa" w:w="3288"/>
+            <w:tcW w:w="3288" w:type="dxa"/>
             <w:vAlign w:val="center"/>
           </w:tcPr>
           <w:p>
             <w:pPr>
-              <w:spacing w:line="240" w:lineRule="auto"/>
-              <w:ind w:firstLine="0"/>
               <w:jc w:val="center"/>
             </w:pPr>
             <w:r>
               <w:rPr>
-                <w:rFonts w:ascii="Times New Roman" w:hAnsi="Times New Roman" w:eastAsia="Times New Roman"/>
                 <w:sz w:val="22"/>
               </w:rPr>
               <w:t>10</w:t>
@@ -2379,21 +2369,16 @@
       <w:tr>
         <w:trPr>
           <w:cantSplit/>
+          <w:jc w:val="center"/>
         </w:trPr>
         <w:tc>
           <w:tcPr>
-            <w:tcW w:type="dxa" w:w="5669"/>
+            <w:tcW w:w="5669" w:type="dxa"/>
             <w:vAlign w:val="center"/>
           </w:tcPr>
           <w:p>
-            <w:pPr>
-              <w:spacing w:line="240" w:lineRule="auto"/>
-              <w:ind w:firstLine="0"/>
-              <w:jc w:val="left"/>
-            </w:pPr>
             <w:r>
               <w:rPr>
-                <w:rFonts w:ascii="Times New Roman" w:hAnsi="Times New Roman" w:eastAsia="Times New Roman"/>
                 <w:sz w:val="22"/>
               </w:rPr>
               <w:t>Минимальный курс</w:t>
@@ -2402,18 +2387,15 @@
         </w:tc>
         <w:tc>
           <w:tcPr>
-            <w:tcW w:type="dxa" w:w="3288"/>
+            <w:tcW w:w="3288" w:type="dxa"/>
             <w:vAlign w:val="center"/>
           </w:tcPr>
           <w:p>
             <w:pPr>
-              <w:spacing w:line="240" w:lineRule="auto"/>
-              <w:ind w:firstLine="0"/>
               <w:jc w:val="center"/>
             </w:pPr>
             <w:r>
               <w:rPr>
-                <w:rFonts w:ascii="Times New Roman" w:hAnsi="Times New Roman" w:eastAsia="Times New Roman"/>
                 <w:sz w:val="22"/>
               </w:rPr>
               <w:t>89</w:t>
@@ -2424,21 +2406,16 @@
       <w:tr>
         <w:trPr>
           <w:cantSplit/>
+          <w:jc w:val="center"/>
         </w:trPr>
         <w:tc>
           <w:tcPr>
-            <w:tcW w:type="dxa" w:w="5669"/>
+            <w:tcW w:w="5669" w:type="dxa"/>
             <w:vAlign w:val="center"/>
           </w:tcPr>
           <w:p>
-            <w:pPr>
-              <w:spacing w:line="240" w:lineRule="auto"/>
-              <w:ind w:firstLine="0"/>
-              <w:jc w:val="left"/>
-            </w:pPr>
             <w:r>
               <w:rPr>
-                <w:rFonts w:ascii="Times New Roman" w:hAnsi="Times New Roman" w:eastAsia="Times New Roman"/>
                 <w:sz w:val="22"/>
               </w:rPr>
               <w:t>Максимальный курс</w:t>
@@ -2447,18 +2424,15 @@
         </w:tc>
         <w:tc>
           <w:tcPr>
-            <w:tcW w:type="dxa" w:w="3288"/>
+            <w:tcW w:w="3288" w:type="dxa"/>
             <w:vAlign w:val="center"/>
           </w:tcPr>
           <w:p>
             <w:pPr>
-              <w:spacing w:line="240" w:lineRule="auto"/>
-              <w:ind w:firstLine="0"/>
               <w:jc w:val="center"/>
             </w:pPr>
             <w:r>
               <w:rPr>
-                <w:rFonts w:ascii="Times New Roman" w:hAnsi="Times New Roman" w:eastAsia="Times New Roman"/>
                 <w:sz w:val="22"/>
               </w:rPr>
               <w:t>97</w:t>
@@ -2469,21 +2443,16 @@
       <w:tr>
         <w:trPr>
           <w:cantSplit/>
+          <w:jc w:val="center"/>
         </w:trPr>
         <w:tc>
           <w:tcPr>
-            <w:tcW w:type="dxa" w:w="5669"/>
+            <w:tcW w:w="5669" w:type="dxa"/>
             <w:vAlign w:val="center"/>
           </w:tcPr>
           <w:p>
-            <w:pPr>
-              <w:spacing w:line="240" w:lineRule="auto"/>
-              <w:ind w:firstLine="0"/>
-              <w:jc w:val="left"/>
-            </w:pPr>
             <w:r>
               <w:rPr>
-                <w:rFonts w:ascii="Times New Roman" w:hAnsi="Times New Roman" w:eastAsia="Times New Roman"/>
                 <w:sz w:val="22"/>
               </w:rPr>
               <w:t>Средний курс</w:t>
@@ -2492,18 +2461,15 @@
         </w:tc>
         <w:tc>
           <w:tcPr>
-            <w:tcW w:type="dxa" w:w="3288"/>
+            <w:tcW w:w="3288" w:type="dxa"/>
             <w:vAlign w:val="center"/>
           </w:tcPr>
           <w:p>
             <w:pPr>
-              <w:spacing w:line="240" w:lineRule="auto"/>
-              <w:ind w:firstLine="0"/>
               <w:jc w:val="center"/>
             </w:pPr>
             <w:r>
               <w:rPr>
-                <w:rFonts w:ascii="Times New Roman" w:hAnsi="Times New Roman" w:eastAsia="Times New Roman"/>
                 <w:sz w:val="22"/>
               </w:rPr>
               <w:t>93,10</w:t>
@@ -2514,21 +2480,16 @@
       <w:tr>
         <w:trPr>
           <w:cantSplit/>
+          <w:jc w:val="center"/>
         </w:trPr>
         <w:tc>
           <w:tcPr>
-            <w:tcW w:type="dxa" w:w="5669"/>
+            <w:tcW w:w="5669" w:type="dxa"/>
             <w:vAlign w:val="center"/>
           </w:tcPr>
           <w:p>
-            <w:pPr>
-              <w:spacing w:line="240" w:lineRule="auto"/>
-              <w:ind w:firstLine="0"/>
-              <w:jc w:val="left"/>
-            </w:pPr>
             <w:r>
               <w:rPr>
-                <w:rFonts w:ascii="Times New Roman" w:hAnsi="Times New Roman" w:eastAsia="Times New Roman"/>
                 <w:sz w:val="22"/>
               </w:rPr>
               <w:t>Медиана</w:t>
@@ -2537,18 +2498,15 @@
         </w:tc>
         <w:tc>
           <w:tcPr>
-            <w:tcW w:type="dxa" w:w="3288"/>
+            <w:tcW w:w="3288" w:type="dxa"/>
             <w:vAlign w:val="center"/>
           </w:tcPr>
           <w:p>
             <w:pPr>
-              <w:spacing w:line="240" w:lineRule="auto"/>
-              <w:ind w:firstLine="0"/>
               <w:jc w:val="center"/>
             </w:pPr>
             <w:r>
               <w:rPr>
-                <w:rFonts w:ascii="Times New Roman" w:hAnsi="Times New Roman" w:eastAsia="Times New Roman"/>
                 <w:sz w:val="22"/>
               </w:rPr>
               <w:t>93,50</w:t>
@@ -2559,21 +2517,16 @@
       <w:tr>
         <w:trPr>
           <w:cantSplit/>
+          <w:jc w:val="center"/>
         </w:trPr>
         <w:tc>
           <w:tcPr>
-            <w:tcW w:type="dxa" w:w="5669"/>
+            <w:tcW w:w="5669" w:type="dxa"/>
             <w:vAlign w:val="center"/>
           </w:tcPr>
           <w:p>
-            <w:pPr>
-              <w:spacing w:line="240" w:lineRule="auto"/>
-              <w:ind w:firstLine="0"/>
-              <w:jc w:val="left"/>
-            </w:pPr>
             <w:r>
               <w:rPr>
-                <w:rFonts w:ascii="Times New Roman" w:hAnsi="Times New Roman" w:eastAsia="Times New Roman"/>
                 <w:sz w:val="22"/>
               </w:rPr>
               <w:t>Дней с курсом выше 93</w:t>
@@ -2582,18 +2535,15 @@
         </w:tc>
         <w:tc>
           <w:tcPr>
-            <w:tcW w:type="dxa" w:w="3288"/>
+            <w:tcW w:w="3288" w:type="dxa"/>
             <w:vAlign w:val="center"/>
           </w:tcPr>
           <w:p>
             <w:pPr>
-              <w:spacing w:line="240" w:lineRule="auto"/>
-              <w:ind w:firstLine="0"/>
               <w:jc w:val="center"/>
             </w:pPr>
             <w:r>
               <w:rPr>
-                <w:rFonts w:ascii="Times New Roman" w:hAnsi="Times New Roman" w:eastAsia="Times New Roman"/>
                 <w:sz w:val="22"/>
               </w:rPr>
               <w:t>5</w:t>
@@ -2605,8 +2555,7 @@
     <w:p>
       <w:pPr>
         <w:keepLines/>
-        <w:spacing w:line="240" w:lineRule="auto" w:before="0" w:after="80"/>
-        <w:ind w:firstLine="0"/>
+        <w:spacing w:after="80"/>
       </w:pPr>
       <w:r>
         <w:rPr>
@@ -2617,13 +2566,12 @@
     </w:p>
     <w:p>
       <w:pPr>
-        <w:spacing w:line="360" w:lineRule="auto" w:after="0"/>
+        <w:spacing w:line="360" w:lineRule="auto"/>
         <w:ind w:firstLine="709"/>
         <w:jc w:val="both"/>
       </w:pPr>
       <w:r>
         <w:rPr>
-          <w:rFonts w:ascii="Times New Roman" w:hAnsi="Times New Roman" w:eastAsia="Times New Roman"/>
           <w:sz w:val="28"/>
         </w:rPr>
         <w:t>При проверке медианы значения сначала располагаются по возрастанию: 89, 90, 91, 92, 93, 94, 94, 95, 96, 97. Для массива из десяти элементов медиана равна среднему пятого и шестого значений: (93 + 94) / 2 = 93,5.</w:t>
@@ -2634,27 +2582,24 @@
         <w:keepNext/>
         <w:pageBreakBefore/>
         <w:spacing w:before="200" w:after="120" w:line="276" w:lineRule="auto"/>
-        <w:ind w:firstLine="0"/>
-        <w:jc w:val="left"/>
-      </w:pPr>
-      <w:r>
-        <w:rPr>
-          <w:rFonts w:ascii="Times New Roman" w:hAnsi="Times New Roman" w:eastAsia="Times New Roman"/>
+      </w:pPr>
+      <w:r>
+        <w:rPr>
           <w:b/>
           <w:sz w:val="32"/>
         </w:rPr>
+        <w:lastRenderedPageBreak/>
         <w:t>Проверка программы и работа с Git</w:t>
       </w:r>
     </w:p>
     <w:p>
       <w:pPr>
-        <w:spacing w:line="360" w:lineRule="auto" w:after="0"/>
+        <w:spacing w:line="360" w:lineRule="auto"/>
         <w:ind w:firstLine="709"/>
         <w:jc w:val="both"/>
       </w:pPr>
       <w:r>
         <w:rPr>
-          <w:rFonts w:ascii="Times New Roman" w:hAnsi="Times New Roman" w:eastAsia="Times New Roman"/>
           <w:sz w:val="28"/>
         </w:rPr>
         <w:t>Модульные тесты отдельно проверяют каждую функцию на небольших массивах с положительными, отрицательными и нулевыми значениями. В них также проверяется медиана массивов чётной и нечётной длины и то, что arr_median не меняет исходные данные. Интеграционный тест использует те же данные, что и вариант 21, и сверяет итоговые значения.</w:t>
@@ -2663,13 +2608,10 @@
     <w:p>
       <w:pPr>
         <w:keepNext/>
-        <w:spacing w:before="80" w:after="60" w:line="240" w:lineRule="auto"/>
-        <w:ind w:firstLine="0"/>
-        <w:jc w:val="left"/>
-      </w:pPr>
-      <w:r>
-        <w:rPr>
-          <w:rFonts w:ascii="Times New Roman" w:hAnsi="Times New Roman" w:eastAsia="Times New Roman"/>
+        <w:spacing w:before="80" w:after="60"/>
+      </w:pPr>
+      <w:r>
+        <w:rPr>
           <w:sz w:val="24"/>
         </w:rPr>
         <w:t>Таблица 3 — Результаты проверки</w:t>
@@ -2678,34 +2620,32 @@
     <w:tbl>
       <w:tblPr>
         <w:tblStyle w:val="ab"/>
-        <w:tblW w:type="auto" w:w="0"/>
+        <w:tblW w:w="0" w:type="auto"/>
         <w:jc w:val="center"/>
-        <w:tblLook w:firstColumn="1" w:firstRow="1" w:lastColumn="0" w:lastRow="0" w:noHBand="0" w:noVBand="1" w:val="04A0"/>
+        <w:tblLook w:val="04A0" w:firstRow="1" w:lastRow="0" w:firstColumn="1" w:lastColumn="0" w:noHBand="0" w:noVBand="1"/>
       </w:tblPr>
       <w:tblGrid>
-        <w:gridCol w:w="3307"/>
-        <w:gridCol w:w="3307"/>
-        <w:gridCol w:w="3307"/>
+        <w:gridCol w:w="1928"/>
+        <w:gridCol w:w="4819"/>
+        <w:gridCol w:w="2211"/>
       </w:tblGrid>
       <w:tr>
         <w:trPr>
-          <w:tblHeader w:val="true"/>
           <w:cantSplit/>
+          <w:tblHeader/>
+          <w:jc w:val="center"/>
         </w:trPr>
         <w:tc>
           <w:tcPr>
-            <w:tcW w:type="dxa" w:w="1928"/>
+            <w:tcW w:w="1928" w:type="dxa"/>
             <w:vAlign w:val="center"/>
           </w:tcPr>
           <w:p>
             <w:pPr>
-              <w:spacing w:line="240" w:lineRule="auto"/>
-              <w:ind w:firstLine="0"/>
               <w:jc w:val="center"/>
             </w:pPr>
             <w:r>
               <w:rPr>
-                <w:rFonts w:ascii="Times New Roman" w:hAnsi="Times New Roman" w:eastAsia="Times New Roman"/>
                 <w:b/>
                 <w:sz w:val="22"/>
               </w:rPr>
@@ -2715,18 +2655,15 @@
         </w:tc>
         <w:tc>
           <w:tcPr>
-            <w:tcW w:type="dxa" w:w="4819"/>
+            <w:tcW w:w="4819" w:type="dxa"/>
             <w:vAlign w:val="center"/>
           </w:tcPr>
           <w:p>
             <w:pPr>
-              <w:spacing w:line="240" w:lineRule="auto"/>
-              <w:ind w:firstLine="0"/>
               <w:jc w:val="center"/>
             </w:pPr>
             <w:r>
               <w:rPr>
-                <w:rFonts w:ascii="Times New Roman" w:hAnsi="Times New Roman" w:eastAsia="Times New Roman"/>
                 <w:b/>
                 <w:sz w:val="22"/>
               </w:rPr>
@@ -2736,18 +2673,15 @@
         </w:tc>
         <w:tc>
           <w:tcPr>
-            <w:tcW w:type="dxa" w:w="2211"/>
+            <w:tcW w:w="2211" w:type="dxa"/>
             <w:vAlign w:val="center"/>
           </w:tcPr>
           <w:p>
             <w:pPr>
-              <w:spacing w:line="240" w:lineRule="auto"/>
-              <w:ind w:firstLine="0"/>
               <w:jc w:val="center"/>
             </w:pPr>
             <w:r>
               <w:rPr>
-                <w:rFonts w:ascii="Times New Roman" w:hAnsi="Times New Roman" w:eastAsia="Times New Roman"/>
                 <w:b/>
                 <w:sz w:val="22"/>
               </w:rPr>
@@ -2759,21 +2693,16 @@
       <w:tr>
         <w:trPr>
           <w:cantSplit/>
+          <w:jc w:val="center"/>
         </w:trPr>
         <w:tc>
           <w:tcPr>
-            <w:tcW w:type="dxa" w:w="1928"/>
+            <w:tcW w:w="1928" w:type="dxa"/>
             <w:vAlign w:val="center"/>
           </w:tcPr>
           <w:p>
-            <w:pPr>
-              <w:spacing w:line="240" w:lineRule="auto"/>
-              <w:ind w:firstLine="0"/>
-              <w:jc w:val="left"/>
-            </w:pPr>
             <w:r>
               <w:rPr>
-                <w:rFonts w:ascii="Times New Roman" w:hAnsi="Times New Roman" w:eastAsia="Times New Roman"/>
                 <w:sz w:val="22"/>
               </w:rPr>
               <w:t>Модульный тест</w:t>
@@ -2782,18 +2711,15 @@
         </w:tc>
         <w:tc>
           <w:tcPr>
-            <w:tcW w:type="dxa" w:w="4819"/>
+            <w:tcW w:w="4819" w:type="dxa"/>
             <w:vAlign w:val="center"/>
           </w:tcPr>
           <w:p>
             <w:pPr>
-              <w:spacing w:line="240" w:lineRule="auto"/>
-              <w:ind w:firstLine="0"/>
               <w:jc w:val="center"/>
             </w:pPr>
             <w:r>
               <w:rPr>
-                <w:rFonts w:ascii="Times New Roman" w:hAnsi="Times New Roman" w:eastAsia="Times New Roman"/>
                 <w:sz w:val="22"/>
               </w:rPr>
               <w:t>Все функции библиотеки и крайние случаи из задания.</w:t>
@@ -2802,18 +2728,15 @@
         </w:tc>
         <w:tc>
           <w:tcPr>
-            <w:tcW w:type="dxa" w:w="2211"/>
+            <w:tcW w:w="2211" w:type="dxa"/>
             <w:vAlign w:val="center"/>
           </w:tcPr>
           <w:p>
             <w:pPr>
-              <w:spacing w:line="240" w:lineRule="auto"/>
-              <w:ind w:firstLine="0"/>
               <w:jc w:val="center"/>
             </w:pPr>
             <w:r>
               <w:rPr>
-                <w:rFonts w:ascii="Times New Roman" w:hAnsi="Times New Roman" w:eastAsia="Times New Roman"/>
                 <w:sz w:val="22"/>
               </w:rPr>
               <w:t>Пройден</w:t>
@@ -2824,21 +2747,16 @@
       <w:tr>
         <w:trPr>
           <w:cantSplit/>
+          <w:jc w:val="center"/>
         </w:trPr>
         <w:tc>
           <w:tcPr>
-            <w:tcW w:type="dxa" w:w="1928"/>
+            <w:tcW w:w="1928" w:type="dxa"/>
             <w:vAlign w:val="center"/>
           </w:tcPr>
           <w:p>
-            <w:pPr>
-              <w:spacing w:line="240" w:lineRule="auto"/>
-              <w:ind w:firstLine="0"/>
-              <w:jc w:val="left"/>
-            </w:pPr>
             <w:r>
               <w:rPr>
-                <w:rFonts w:ascii="Times New Roman" w:hAnsi="Times New Roman" w:eastAsia="Times New Roman"/>
                 <w:sz w:val="22"/>
               </w:rPr>
               <w:t>Интеграционный тест</w:t>
@@ -2847,18 +2765,15 @@
         </w:tc>
         <w:tc>
           <w:tcPr>
-            <w:tcW w:type="dxa" w:w="4819"/>
+            <w:tcW w:w="4819" w:type="dxa"/>
             <w:vAlign w:val="center"/>
           </w:tcPr>
           <w:p>
             <w:pPr>
-              <w:spacing w:line="240" w:lineRule="auto"/>
-              <w:ind w:firstLine="0"/>
               <w:jc w:val="center"/>
             </w:pPr>
             <w:r>
               <w:rPr>
-                <w:rFonts w:ascii="Times New Roman" w:hAnsi="Times New Roman" w:eastAsia="Times New Roman"/>
                 <w:sz w:val="22"/>
               </w:rPr>
               <w:t>Расчёт показателей варианта 21 через библиотеку.</w:t>
@@ -2867,18 +2782,15 @@
         </w:tc>
         <w:tc>
           <w:tcPr>
-            <w:tcW w:type="dxa" w:w="2211"/>
+            <w:tcW w:w="2211" w:type="dxa"/>
             <w:vAlign w:val="center"/>
           </w:tcPr>
           <w:p>
             <w:pPr>
-              <w:spacing w:line="240" w:lineRule="auto"/>
-              <w:ind w:firstLine="0"/>
               <w:jc w:val="center"/>
             </w:pPr>
             <w:r>
               <w:rPr>
-                <w:rFonts w:ascii="Times New Roman" w:hAnsi="Times New Roman" w:eastAsia="Times New Roman"/>
                 <w:sz w:val="22"/>
               </w:rPr>
               <w:t>Пройден</w:t>
@@ -2889,21 +2801,16 @@
       <w:tr>
         <w:trPr>
           <w:cantSplit/>
+          <w:jc w:val="center"/>
         </w:trPr>
         <w:tc>
           <w:tcPr>
-            <w:tcW w:type="dxa" w:w="1928"/>
+            <w:tcW w:w="1928" w:type="dxa"/>
             <w:vAlign w:val="center"/>
           </w:tcPr>
           <w:p>
-            <w:pPr>
-              <w:spacing w:line="240" w:lineRule="auto"/>
-              <w:ind w:firstLine="0"/>
-              <w:jc w:val="left"/>
-            </w:pPr>
             <w:r>
               <w:rPr>
-                <w:rFonts w:ascii="Times New Roman" w:hAnsi="Times New Roman" w:eastAsia="Times New Roman"/>
                 <w:sz w:val="22"/>
               </w:rPr>
               <w:t>Сборка и запуск</w:t>
@@ -2912,18 +2819,15 @@
         </w:tc>
         <w:tc>
           <w:tcPr>
-            <w:tcW w:type="dxa" w:w="4819"/>
+            <w:tcW w:w="4819" w:type="dxa"/>
             <w:vAlign w:val="center"/>
           </w:tcPr>
           <w:p>
             <w:pPr>
-              <w:spacing w:line="240" w:lineRule="auto"/>
-              <w:ind w:firstLine="0"/>
               <w:jc w:val="center"/>
             </w:pPr>
             <w:r>
               <w:rPr>
-                <w:rFonts w:ascii="Times New Roman" w:hAnsi="Times New Roman" w:eastAsia="Times New Roman"/>
                 <w:sz w:val="22"/>
               </w:rPr>
               <w:t>app и variant_21, динамическая библиотека.</w:t>
@@ -2932,18 +2836,15 @@
         </w:tc>
         <w:tc>
           <w:tcPr>
-            <w:tcW w:type="dxa" w:w="2211"/>
+            <w:tcW w:w="2211" w:type="dxa"/>
             <w:vAlign w:val="center"/>
           </w:tcPr>
           <w:p>
             <w:pPr>
-              <w:spacing w:line="240" w:lineRule="auto"/>
-              <w:ind w:firstLine="0"/>
               <w:jc w:val="center"/>
             </w:pPr>
             <w:r>
               <w:rPr>
-                <w:rFonts w:ascii="Times New Roman" w:hAnsi="Times New Roman" w:eastAsia="Times New Roman"/>
                 <w:sz w:val="22"/>
               </w:rPr>
               <w:t>Успешно</w:t>
@@ -2955,8 +2856,7 @@
     <w:p>
       <w:pPr>
         <w:keepLines/>
-        <w:spacing w:line="240" w:lineRule="auto" w:before="0" w:after="80"/>
-        <w:ind w:firstLine="0"/>
+        <w:spacing w:after="80"/>
       </w:pPr>
       <w:r>
         <w:rPr>
@@ -2967,13 +2867,12 @@
     </w:p>
     <w:p>
       <w:pPr>
-        <w:spacing w:line="360" w:lineRule="auto" w:after="0"/>
+        <w:spacing w:line="360" w:lineRule="auto"/>
         <w:ind w:firstLine="709"/>
         <w:jc w:val="both"/>
       </w:pPr>
       <w:r>
         <w:rPr>
-          <w:rFonts w:ascii="Times New Roman" w:hAnsi="Times New Roman" w:eastAsia="Times New Roman"/>
           <w:sz w:val="28"/>
         </w:rPr>
         <w:t>Проект собирался локально с помощью CMake и AppleClang. CTest запустил две проверки; обе завершились успешно. Программа варианта вывела минимум 89, максимум 97, среднее 93,10, медиану 93,50 и пять дней с курсом выше 93.</w:t>
@@ -2981,13 +2880,12 @@
     </w:p>
     <w:p>
       <w:pPr>
-        <w:spacing w:line="360" w:lineRule="auto" w:after="0"/>
+        <w:spacing w:line="360" w:lineRule="auto"/>
         <w:ind w:firstLine="709"/>
         <w:jc w:val="both"/>
       </w:pPr>
       <w:r>
         <w:rPr>
-          <w:rFonts w:ascii="Times New Roman" w:hAnsi="Times New Roman" w:eastAsia="Times New Roman"/>
           <w:sz w:val="28"/>
         </w:rPr>
         <w:t>Для проекта создан публичный GitHub-репозиторий. Основная ветка называется main; демонстратор сначала добавлялся в feature/variant-21, затем ветку объединили с main. Версия отмечена тегом v1.0.0. GitHub Actions автоматически собирает проект и запускает тесты при отправке изменений; последний запуск завершился успешно.</w:t>
@@ -2998,27 +2896,24 @@
         <w:keepNext/>
         <w:pageBreakBefore/>
         <w:spacing w:before="200" w:after="120" w:line="276" w:lineRule="auto"/>
-        <w:ind w:firstLine="0"/>
-        <w:jc w:val="left"/>
-      </w:pPr>
-      <w:r>
-        <w:rPr>
-          <w:rFonts w:ascii="Times New Roman" w:hAnsi="Times New Roman" w:eastAsia="Times New Roman"/>
+      </w:pPr>
+      <w:r>
+        <w:rPr>
           <w:b/>
           <w:sz w:val="32"/>
         </w:rPr>
+        <w:lastRenderedPageBreak/>
         <w:t>Вывод</w:t>
       </w:r>
     </w:p>
     <w:p>
       <w:pPr>
-        <w:spacing w:line="360" w:lineRule="auto" w:after="0"/>
+        <w:spacing w:line="360" w:lineRule="auto"/>
         <w:ind w:firstLine="709"/>
         <w:jc w:val="both"/>
       </w:pPr>
       <w:r>
         <w:rPr>
-          <w:rFonts w:ascii="Times New Roman" w:hAnsi="Times New Roman" w:eastAsia="Times New Roman"/>
           <w:sz w:val="28"/>
         </w:rPr>
         <w:t>В результате работы была создана библиотека для обработки массивов целых чисел, собраны её статическая и динамическая версии, а также программы app и variant_21. Для варианта 21 получены курс от 89 до 97, среднее 93,10, медиана 93,50 и пять дней выше 93. Модульная и интеграционная проверки прошли успешно. Проект подготовлен к сборке на разных системах с помощью CMake.</w:t>
@@ -3028,12 +2923,9 @@
       <w:pPr>
         <w:keepNext/>
         <w:spacing w:before="200" w:after="120" w:line="276" w:lineRule="auto"/>
-        <w:ind w:firstLine="0"/>
-        <w:jc w:val="left"/>
-      </w:pPr>
-      <w:r>
-        <w:rPr>
-          <w:rFonts w:ascii="Times New Roman" w:hAnsi="Times New Roman" w:eastAsia="Times New Roman"/>
+      </w:pPr>
+      <w:r>
+        <w:rPr>
           <w:b/>
           <w:sz w:val="32"/>
         </w:rPr>
@@ -3042,13 +2934,11 @@
     </w:p>
     <w:p>
       <w:pPr>
-        <w:spacing w:line="360" w:lineRule="auto" w:after="0"/>
-        <w:ind w:firstLine="0"/>
+        <w:spacing w:line="360" w:lineRule="auto"/>
         <w:jc w:val="both"/>
       </w:pPr>
       <w:r>
         <w:rPr>
-          <w:rFonts w:ascii="Times New Roman" w:hAnsi="Times New Roman" w:eastAsia="Times New Roman"/>
           <w:sz w:val="24"/>
         </w:rPr>
         <w:t>[1] Лабораторная работа 2. Разработка кроссплатформенной динамической библиотеки операций над массивами (калькулятора) : методические указания. — Электронный документ, предоставленный для выполнения работы.</w:t>
@@ -3056,13 +2946,11 @@
     </w:p>
     <w:p>
       <w:pPr>
-        <w:spacing w:line="360" w:lineRule="auto" w:after="0"/>
-        <w:ind w:firstLine="0"/>
+        <w:spacing w:line="360" w:lineRule="auto"/>
         <w:jc w:val="both"/>
       </w:pPr>
       <w:r>
         <w:rPr>
-          <w:rFonts w:ascii="Times New Roman" w:hAnsi="Times New Roman" w:eastAsia="Times New Roman"/>
           <w:sz w:val="24"/>
         </w:rPr>
         <w:t>[2] ГОСТ Р 2.105-2019. Единая система конструкторской документации. Общие требования к текстовым документам.</w:t>
@@ -3070,13 +2958,11 @@
     </w:p>
     <w:p>
       <w:pPr>
-        <w:spacing w:line="360" w:lineRule="auto" w:after="0"/>
-        <w:ind w:firstLine="0"/>
+        <w:spacing w:line="360" w:lineRule="auto"/>
         <w:jc w:val="both"/>
       </w:pPr>
       <w:r>
         <w:rPr>
-          <w:rFonts w:ascii="Times New Roman" w:hAnsi="Times New Roman" w:eastAsia="Times New Roman"/>
           <w:sz w:val="24"/>
         </w:rPr>
         <w:t>[3] Оформление отчётов : презентация с требованиями к листингам, таблицам, приложениям и списку источников. — Электронный документ, предоставленный для выполнения работы.</w:t>
@@ -3084,50 +2970,40 @@
     </w:p>
     <w:p>
       <w:pPr>
-        <w:spacing w:line="360" w:lineRule="auto" w:after="0"/>
-        <w:ind w:firstLine="0"/>
+        <w:spacing w:line="360" w:lineRule="auto"/>
         <w:jc w:val="both"/>
       </w:pPr>
       <w:r>
         <w:rPr>
-          <w:rFonts w:ascii="Times New Roman" w:hAnsi="Times New Roman" w:eastAsia="Times New Roman"/>
           <w:sz w:val="24"/>
         </w:rPr>
         <w:t>[4] Оформление лабораторных работ : образец титульного листа и структуры отчёта. — Электронный документ, предоставленный для выполнения работы.</w:t>
       </w:r>
     </w:p>
     <w:p>
-      <w:pPr>
-        <w:ind w:firstLine="0"/>
-      </w:pPr>
       <w:r>
         <w:br w:type="page"/>
       </w:r>
     </w:p>
     <w:p>
       <w:pPr>
-        <w:spacing w:line="240" w:lineRule="auto"/>
-        <w:ind w:firstLine="0"/>
         <w:jc w:val="center"/>
       </w:pPr>
       <w:r>
         <w:rPr>
-          <w:rFonts w:ascii="Times New Roman" w:hAnsi="Times New Roman" w:eastAsia="Times New Roman"/>
           <w:b/>
           <w:sz w:val="28"/>
         </w:rPr>
+        <w:lastRenderedPageBreak/>
         <w:t>ПРИЛОЖЕНИЕ А</w:t>
       </w:r>
     </w:p>
     <w:p>
       <w:pPr>
-        <w:spacing w:line="240" w:lineRule="auto"/>
-        <w:ind w:firstLine="0"/>
         <w:jc w:val="center"/>
       </w:pPr>
       <w:r>
         <w:rPr>
-          <w:rFonts w:ascii="Times New Roman" w:hAnsi="Times New Roman" w:eastAsia="Times New Roman"/>
           <w:b/>
           <w:sz w:val="28"/>
         </w:rPr>
@@ -3136,13 +3012,11 @@
     </w:p>
     <w:p>
       <w:pPr>
-        <w:spacing w:line="360" w:lineRule="auto" w:after="0"/>
-        <w:ind w:firstLine="0"/>
+        <w:spacing w:line="360" w:lineRule="auto"/>
         <w:jc w:val="both"/>
       </w:pPr>
       <w:r>
         <w:rPr>
-          <w:rFonts w:ascii="Times New Roman" w:hAnsi="Times New Roman" w:eastAsia="Times New Roman"/>
           <w:sz w:val="24"/>
         </w:rPr>
         <w:t>Полный исходный код демонстрационной программы приведён ниже. Основные операции выполняются функциями динамической библиотеки.</w:t>
@@ -3151,416 +3025,748 @@
     <w:p>
       <w:pPr>
         <w:keepLines/>
-        <w:spacing w:line="240" w:lineRule="auto" w:before="0" w:after="0"/>
-        <w:ind w:firstLine="0" w:left="454"/>
-        <w:jc w:val="left"/>
-      </w:pPr>
-      <w:r>
-        <w:rPr>
-          <w:rFonts w:ascii="Courier New" w:hAnsi="Courier New" w:eastAsia="Courier New"/>
-          <w:sz w:val="24"/>
+        <w:ind w:left="454"/>
+        <w:rPr>
+          <w:lang w:val="en-US"/>
+        </w:rPr>
+      </w:pPr>
+      <w:r>
+        <w:rPr>
+          <w:rFonts w:ascii="Courier New" w:eastAsia="Courier New" w:hAnsi="Courier New"/>
+          <w:sz w:val="24"/>
+          <w:lang w:val="en-US"/>
         </w:rPr>
         <w:t>#include "arraylib.h"</w:t>
       </w:r>
       <w:r>
+        <w:rPr>
+          <w:lang w:val="en-US"/>
+        </w:rPr>
         <w:br/>
       </w:r>
       <w:r>
         <w:rPr>
-          <w:rFonts w:ascii="Courier New" w:hAnsi="Courier New" w:eastAsia="Courier New"/>
-          <w:sz w:val="24"/>
-        </w:rPr>
-      </w:r>
-      <w:r>
+          <w:lang w:val="en-US"/>
+        </w:rPr>
         <w:br/>
       </w:r>
       <w:r>
         <w:rPr>
-          <w:rFonts w:ascii="Courier New" w:hAnsi="Courier New" w:eastAsia="Courier New"/>
-          <w:sz w:val="24"/>
+          <w:rFonts w:ascii="Courier New" w:eastAsia="Courier New" w:hAnsi="Courier New"/>
+          <w:sz w:val="24"/>
+          <w:lang w:val="en-US"/>
         </w:rPr>
         <w:t>#include &lt;cstddef&gt;</w:t>
       </w:r>
       <w:r>
+        <w:rPr>
+          <w:lang w:val="en-US"/>
+        </w:rPr>
         <w:br/>
       </w:r>
       <w:r>
         <w:rPr>
-          <w:rFonts w:ascii="Courier New" w:hAnsi="Courier New" w:eastAsia="Courier New"/>
-          <w:sz w:val="24"/>
+          <w:rFonts w:ascii="Courier New" w:eastAsia="Courier New" w:hAnsi="Courier New"/>
+          <w:sz w:val="24"/>
+          <w:lang w:val="en-US"/>
         </w:rPr>
         <w:t>#include &lt;iomanip&gt;</w:t>
       </w:r>
       <w:r>
+        <w:rPr>
+          <w:lang w:val="en-US"/>
+        </w:rPr>
         <w:br/>
       </w:r>
       <w:r>
         <w:rPr>
-          <w:rFonts w:ascii="Courier New" w:hAnsi="Courier New" w:eastAsia="Courier New"/>
-          <w:sz w:val="24"/>
+          <w:rFonts w:ascii="Courier New" w:eastAsia="Courier New" w:hAnsi="Courier New"/>
+          <w:sz w:val="24"/>
+          <w:lang w:val="en-US"/>
         </w:rPr>
         <w:t>#include &lt;iostream&gt;</w:t>
       </w:r>
       <w:r>
+        <w:rPr>
+          <w:lang w:val="en-US"/>
+        </w:rPr>
         <w:br/>
       </w:r>
       <w:r>
         <w:rPr>
-          <w:rFonts w:ascii="Courier New" w:hAnsi="Courier New" w:eastAsia="Courier New"/>
-          <w:sz w:val="24"/>
-        </w:rPr>
-      </w:r>
-      <w:r>
+          <w:lang w:val="en-US"/>
+        </w:rPr>
         <w:br/>
       </w:r>
       <w:r>
         <w:rPr>
-          <w:rFonts w:ascii="Courier New" w:hAnsi="Courier New" w:eastAsia="Courier New"/>
-          <w:sz w:val="24"/>
+          <w:rFonts w:ascii="Courier New" w:eastAsia="Courier New" w:hAnsi="Courier New"/>
+          <w:sz w:val="24"/>
+          <w:lang w:val="en-US"/>
         </w:rPr>
         <w:t>int main() {</w:t>
       </w:r>
       <w:r>
+        <w:rPr>
+          <w:lang w:val="en-US"/>
+        </w:rPr>
         <w:br/>
       </w:r>
       <w:r>
         <w:rPr>
-          <w:rFonts w:ascii="Courier New" w:hAnsi="Courier New" w:eastAsia="Courier New"/>
-          <w:sz w:val="24"/>
+          <w:rFonts w:ascii="Courier New" w:eastAsia="Courier New" w:hAnsi="Courier New"/>
+          <w:sz w:val="24"/>
+          <w:lang w:val="en-US"/>
         </w:rPr>
         <w:t xml:space="preserve">    const int exchange_rate[] = {</w:t>
       </w:r>
       <w:r>
+        <w:rPr>
+          <w:lang w:val="en-US"/>
+        </w:rPr>
         <w:br/>
       </w:r>
       <w:r>
         <w:rPr>
-          <w:rFonts w:ascii="Courier New" w:hAnsi="Courier New" w:eastAsia="Courier New"/>
-          <w:sz w:val="24"/>
+          <w:rFonts w:ascii="Courier New" w:eastAsia="Courier New" w:hAnsi="Courier New"/>
+          <w:sz w:val="24"/>
+          <w:lang w:val="en-US"/>
         </w:rPr>
         <w:t xml:space="preserve">        91, 93, 92, 95, 94,</w:t>
       </w:r>
       <w:r>
+        <w:rPr>
+          <w:lang w:val="en-US"/>
+        </w:rPr>
         <w:br/>
       </w:r>
       <w:r>
         <w:rPr>
-          <w:rFonts w:ascii="Courier New" w:hAnsi="Courier New" w:eastAsia="Courier New"/>
-          <w:sz w:val="24"/>
+          <w:rFonts w:ascii="Courier New" w:eastAsia="Courier New" w:hAnsi="Courier New"/>
+          <w:sz w:val="24"/>
+          <w:lang w:val="en-US"/>
         </w:rPr>
         <w:t xml:space="preserve">        96, 90, 89, 94, 97</w:t>
       </w:r>
       <w:r>
+        <w:rPr>
+          <w:lang w:val="en-US"/>
+        </w:rPr>
         <w:br/>
       </w:r>
       <w:r>
         <w:rPr>
-          <w:rFonts w:ascii="Courier New" w:hAnsi="Courier New" w:eastAsia="Courier New"/>
-          <w:sz w:val="24"/>
+          <w:rFonts w:ascii="Courier New" w:eastAsia="Courier New" w:hAnsi="Courier New"/>
+          <w:sz w:val="24"/>
+          <w:lang w:val="en-US"/>
         </w:rPr>
         <w:t xml:space="preserve">    };</w:t>
       </w:r>
       <w:r>
+        <w:rPr>
+          <w:lang w:val="en-US"/>
+        </w:rPr>
         <w:br/>
       </w:r>
       <w:r>
         <w:rPr>
-          <w:rFonts w:ascii="Courier New" w:hAnsi="Courier New" w:eastAsia="Courier New"/>
-          <w:sz w:val="24"/>
+          <w:rFonts w:ascii="Courier New" w:eastAsia="Courier New" w:hAnsi="Courier New"/>
+          <w:sz w:val="24"/>
+          <w:lang w:val="en-US"/>
         </w:rPr>
         <w:t xml:space="preserve">    const std::size_t n =</w:t>
       </w:r>
       <w:r>
+        <w:rPr>
+          <w:lang w:val="en-US"/>
+        </w:rPr>
         <w:br/>
       </w:r>
       <w:r>
         <w:rPr>
-          <w:rFonts w:ascii="Courier New" w:hAnsi="Courier New" w:eastAsia="Courier New"/>
-          <w:sz w:val="24"/>
+          <w:rFonts w:ascii="Courier New" w:eastAsia="Courier New" w:hAnsi="Courier New"/>
+          <w:sz w:val="24"/>
+          <w:lang w:val="en-US"/>
         </w:rPr>
         <w:t xml:space="preserve">        sizeof(exchange_rate) / sizeof(exchange_rate[0]);</w:t>
       </w:r>
       <w:r>
+        <w:rPr>
+          <w:lang w:val="en-US"/>
+        </w:rPr>
         <w:br/>
       </w:r>
       <w:r>
         <w:rPr>
-          <w:rFonts w:ascii="Courier New" w:hAnsi="Courier New" w:eastAsia="Courier New"/>
-          <w:sz w:val="24"/>
-        </w:rPr>
-      </w:r>
-      <w:r>
+          <w:lang w:val="en-US"/>
+        </w:rPr>
         <w:br/>
       </w:r>
       <w:r>
         <w:rPr>
-          <w:rFonts w:ascii="Courier New" w:hAnsi="Courier New" w:eastAsia="Courier New"/>
-          <w:sz w:val="24"/>
+          <w:rFonts w:ascii="Courier New" w:eastAsia="Courier New" w:hAnsi="Courier New"/>
+          <w:sz w:val="24"/>
+          <w:lang w:val="en-US"/>
         </w:rPr>
         <w:t xml:space="preserve">    int days_above_93 = 0;</w:t>
       </w:r>
       <w:r>
+        <w:rPr>
+          <w:lang w:val="en-US"/>
+        </w:rPr>
         <w:br/>
       </w:r>
       <w:r>
         <w:rPr>
-          <w:rFonts w:ascii="Courier New" w:hAnsi="Courier New" w:eastAsia="Courier New"/>
-          <w:sz w:val="24"/>
+          <w:rFonts w:ascii="Courier New" w:eastAsia="Courier New" w:hAnsi="Courier New"/>
+          <w:sz w:val="24"/>
+          <w:lang w:val="en-US"/>
         </w:rPr>
         <w:t xml:space="preserve">    for (std::size_t i = 0; i &lt; n; ++i) {</w:t>
       </w:r>
       <w:r>
+        <w:rPr>
+          <w:lang w:val="en-US"/>
+        </w:rPr>
         <w:br/>
       </w:r>
       <w:r>
         <w:rPr>
-          <w:rFonts w:ascii="Courier New" w:hAnsi="Courier New" w:eastAsia="Courier New"/>
-          <w:sz w:val="24"/>
+          <w:rFonts w:ascii="Courier New" w:eastAsia="Courier New" w:hAnsi="Courier New"/>
+          <w:sz w:val="24"/>
+          <w:lang w:val="en-US"/>
         </w:rPr>
         <w:t xml:space="preserve">        if (exchange_rate[i] &gt; 93) ++days_above_93;</w:t>
       </w:r>
       <w:r>
+        <w:rPr>
+          <w:lang w:val="en-US"/>
+        </w:rPr>
         <w:br/>
       </w:r>
       <w:r>
         <w:rPr>
-          <w:rFonts w:ascii="Courier New" w:hAnsi="Courier New" w:eastAsia="Courier New"/>
-          <w:sz w:val="24"/>
+          <w:rFonts w:ascii="Courier New" w:eastAsia="Courier New" w:hAnsi="Courier New"/>
+          <w:sz w:val="24"/>
+          <w:lang w:val="en-US"/>
         </w:rPr>
         <w:t xml:space="preserve">    }</w:t>
       </w:r>
       <w:r>
+        <w:rPr>
+          <w:lang w:val="en-US"/>
+        </w:rPr>
         <w:br/>
       </w:r>
       <w:r>
         <w:rPr>
-          <w:rFonts w:ascii="Courier New" w:hAnsi="Courier New" w:eastAsia="Courier New"/>
-          <w:sz w:val="24"/>
-        </w:rPr>
-      </w:r>
-      <w:r>
+          <w:lang w:val="en-US"/>
+        </w:rPr>
         <w:br/>
       </w:r>
       <w:r>
         <w:rPr>
-          <w:rFonts w:ascii="Courier New" w:hAnsi="Courier New" w:eastAsia="Courier New"/>
-          <w:sz w:val="24"/>
-        </w:rPr>
-        <w:t xml:space="preserve">    std::cout &lt;&lt; "Курс по дням: ";</w:t>
-      </w:r>
-      <w:r>
+          <w:rFonts w:ascii="Courier New" w:eastAsia="Courier New" w:hAnsi="Courier New"/>
+          <w:sz w:val="24"/>
+          <w:lang w:val="en-US"/>
+        </w:rPr>
+        <w:t xml:space="preserve">    std::cout &lt;&lt; "</w:t>
+      </w:r>
+      <w:r>
+        <w:rPr>
+          <w:rFonts w:ascii="Courier New" w:eastAsia="Courier New" w:hAnsi="Courier New"/>
+          <w:sz w:val="24"/>
+        </w:rPr>
+        <w:t>Курс</w:t>
+      </w:r>
+      <w:r>
+        <w:rPr>
+          <w:rFonts w:ascii="Courier New" w:eastAsia="Courier New" w:hAnsi="Courier New"/>
+          <w:sz w:val="24"/>
+          <w:lang w:val="en-US"/>
+        </w:rPr>
+        <w:t xml:space="preserve"> </w:t>
+      </w:r>
+      <w:r>
+        <w:rPr>
+          <w:rFonts w:ascii="Courier New" w:eastAsia="Courier New" w:hAnsi="Courier New"/>
+          <w:sz w:val="24"/>
+        </w:rPr>
+        <w:t>по</w:t>
+      </w:r>
+      <w:r>
+        <w:rPr>
+          <w:rFonts w:ascii="Courier New" w:eastAsia="Courier New" w:hAnsi="Courier New"/>
+          <w:sz w:val="24"/>
+          <w:lang w:val="en-US"/>
+        </w:rPr>
+        <w:t xml:space="preserve"> </w:t>
+      </w:r>
+      <w:r>
+        <w:rPr>
+          <w:rFonts w:ascii="Courier New" w:eastAsia="Courier New" w:hAnsi="Courier New"/>
+          <w:sz w:val="24"/>
+        </w:rPr>
+        <w:t>дням</w:t>
+      </w:r>
+      <w:r>
+        <w:rPr>
+          <w:rFonts w:ascii="Courier New" w:eastAsia="Courier New" w:hAnsi="Courier New"/>
+          <w:sz w:val="24"/>
+          <w:lang w:val="en-US"/>
+        </w:rPr>
+        <w:t>: ";</w:t>
+      </w:r>
+      <w:r>
+        <w:rPr>
+          <w:lang w:val="en-US"/>
+        </w:rPr>
         <w:br/>
       </w:r>
       <w:r>
         <w:rPr>
-          <w:rFonts w:ascii="Courier New" w:hAnsi="Courier New" w:eastAsia="Courier New"/>
-          <w:sz w:val="24"/>
+          <w:rFonts w:ascii="Courier New" w:eastAsia="Courier New" w:hAnsi="Courier New"/>
+          <w:sz w:val="24"/>
+          <w:lang w:val="en-US"/>
         </w:rPr>
         <w:t xml:space="preserve">    for (std::size_t i = 0; i &lt; n; ++i) {</w:t>
       </w:r>
       <w:r>
+        <w:rPr>
+          <w:lang w:val="en-US"/>
+        </w:rPr>
         <w:br/>
       </w:r>
       <w:r>
         <w:rPr>
-          <w:rFonts w:ascii="Courier New" w:hAnsi="Courier New" w:eastAsia="Courier New"/>
-          <w:sz w:val="24"/>
+          <w:rFonts w:ascii="Courier New" w:eastAsia="Courier New" w:hAnsi="Courier New"/>
+          <w:sz w:val="24"/>
+          <w:lang w:val="en-US"/>
         </w:rPr>
         <w:t xml:space="preserve">        if (i != 0) std::cout &lt;&lt; ", ";</w:t>
       </w:r>
       <w:r>
+        <w:rPr>
+          <w:lang w:val="en-US"/>
+        </w:rPr>
         <w:br/>
       </w:r>
       <w:r>
         <w:rPr>
-          <w:rFonts w:ascii="Courier New" w:hAnsi="Courier New" w:eastAsia="Courier New"/>
-          <w:sz w:val="24"/>
+          <w:rFonts w:ascii="Courier New" w:eastAsia="Courier New" w:hAnsi="Courier New"/>
+          <w:sz w:val="24"/>
+          <w:lang w:val="en-US"/>
         </w:rPr>
         <w:t xml:space="preserve">        std::cout &lt;&lt; exchange_rate[i];</w:t>
       </w:r>
       <w:r>
+        <w:rPr>
+          <w:lang w:val="en-US"/>
+        </w:rPr>
         <w:br/>
       </w:r>
       <w:r>
         <w:rPr>
-          <w:rFonts w:ascii="Courier New" w:hAnsi="Courier New" w:eastAsia="Courier New"/>
-          <w:sz w:val="24"/>
+          <w:rFonts w:ascii="Courier New" w:eastAsia="Courier New" w:hAnsi="Courier New"/>
+          <w:sz w:val="24"/>
+          <w:lang w:val="en-US"/>
         </w:rPr>
         <w:t xml:space="preserve">    }</w:t>
       </w:r>
       <w:r>
+        <w:rPr>
+          <w:lang w:val="en-US"/>
+        </w:rPr>
         <w:br/>
       </w:r>
       <w:r>
         <w:rPr>
-          <w:rFonts w:ascii="Courier New" w:hAnsi="Courier New" w:eastAsia="Courier New"/>
-          <w:sz w:val="24"/>
+          <w:rFonts w:ascii="Courier New" w:eastAsia="Courier New" w:hAnsi="Courier New"/>
+          <w:sz w:val="24"/>
+          <w:lang w:val="en-US"/>
         </w:rPr>
         <w:t xml:space="preserve">    std::cout &lt;&lt; '\n'</w:t>
       </w:r>
       <w:r>
+        <w:rPr>
+          <w:lang w:val="en-US"/>
+        </w:rPr>
         <w:br/>
       </w:r>
       <w:r>
         <w:rPr>
-          <w:rFonts w:ascii="Courier New" w:hAnsi="Courier New" w:eastAsia="Courier New"/>
-          <w:sz w:val="24"/>
-        </w:rPr>
-        <w:t xml:space="preserve">              &lt;&lt; "Минимальный курс: "</w:t>
-      </w:r>
-      <w:r>
+          <w:rFonts w:ascii="Courier New" w:eastAsia="Courier New" w:hAnsi="Courier New"/>
+          <w:sz w:val="24"/>
+          <w:lang w:val="en-US"/>
+        </w:rPr>
+        <w:t xml:space="preserve">              &lt;&lt; "</w:t>
+      </w:r>
+      <w:r>
+        <w:rPr>
+          <w:rFonts w:ascii="Courier New" w:eastAsia="Courier New" w:hAnsi="Courier New"/>
+          <w:sz w:val="24"/>
+        </w:rPr>
+        <w:t>Минимальный</w:t>
+      </w:r>
+      <w:r>
+        <w:rPr>
+          <w:rFonts w:ascii="Courier New" w:eastAsia="Courier New" w:hAnsi="Courier New"/>
+          <w:sz w:val="24"/>
+          <w:lang w:val="en-US"/>
+        </w:rPr>
+        <w:t xml:space="preserve"> </w:t>
+      </w:r>
+      <w:r>
+        <w:rPr>
+          <w:rFonts w:ascii="Courier New" w:eastAsia="Courier New" w:hAnsi="Courier New"/>
+          <w:sz w:val="24"/>
+        </w:rPr>
+        <w:t>курс</w:t>
+      </w:r>
+      <w:r>
+        <w:rPr>
+          <w:rFonts w:ascii="Courier New" w:eastAsia="Courier New" w:hAnsi="Courier New"/>
+          <w:sz w:val="24"/>
+          <w:lang w:val="en-US"/>
+        </w:rPr>
+        <w:t>: "</w:t>
+      </w:r>
+      <w:r>
+        <w:rPr>
+          <w:lang w:val="en-US"/>
+        </w:rPr>
         <w:br/>
       </w:r>
       <w:r>
         <w:rPr>
-          <w:rFonts w:ascii="Courier New" w:hAnsi="Courier New" w:eastAsia="Courier New"/>
-          <w:sz w:val="24"/>
+          <w:rFonts w:ascii="Courier New" w:eastAsia="Courier New" w:hAnsi="Courier New"/>
+          <w:sz w:val="24"/>
+          <w:lang w:val="en-US"/>
         </w:rPr>
         <w:t xml:space="preserve">              &lt;&lt; arr_min(exchange_rate, n) &lt;&lt; '\n'</w:t>
       </w:r>
       <w:r>
+        <w:rPr>
+          <w:lang w:val="en-US"/>
+        </w:rPr>
         <w:br/>
       </w:r>
       <w:r>
         <w:rPr>
-          <w:rFonts w:ascii="Courier New" w:hAnsi="Courier New" w:eastAsia="Courier New"/>
-          <w:sz w:val="24"/>
-        </w:rPr>
-        <w:t xml:space="preserve">              &lt;&lt; "Максимальный курс: "</w:t>
-      </w:r>
-      <w:r>
+          <w:rFonts w:ascii="Courier New" w:eastAsia="Courier New" w:hAnsi="Courier New"/>
+          <w:sz w:val="24"/>
+          <w:lang w:val="en-US"/>
+        </w:rPr>
+        <w:t xml:space="preserve">              &lt;&lt; "</w:t>
+      </w:r>
+      <w:r>
+        <w:rPr>
+          <w:rFonts w:ascii="Courier New" w:eastAsia="Courier New" w:hAnsi="Courier New"/>
+          <w:sz w:val="24"/>
+        </w:rPr>
+        <w:t>Максимальный</w:t>
+      </w:r>
+      <w:r>
+        <w:rPr>
+          <w:rFonts w:ascii="Courier New" w:eastAsia="Courier New" w:hAnsi="Courier New"/>
+          <w:sz w:val="24"/>
+          <w:lang w:val="en-US"/>
+        </w:rPr>
+        <w:t xml:space="preserve"> </w:t>
+      </w:r>
+      <w:r>
+        <w:rPr>
+          <w:rFonts w:ascii="Courier New" w:eastAsia="Courier New" w:hAnsi="Courier New"/>
+          <w:sz w:val="24"/>
+        </w:rPr>
+        <w:t>курс</w:t>
+      </w:r>
+      <w:r>
+        <w:rPr>
+          <w:rFonts w:ascii="Courier New" w:eastAsia="Courier New" w:hAnsi="Courier New"/>
+          <w:sz w:val="24"/>
+          <w:lang w:val="en-US"/>
+        </w:rPr>
+        <w:t>: "</w:t>
+      </w:r>
+      <w:r>
+        <w:rPr>
+          <w:lang w:val="en-US"/>
+        </w:rPr>
         <w:br/>
       </w:r>
       <w:r>
         <w:rPr>
-          <w:rFonts w:ascii="Courier New" w:hAnsi="Courier New" w:eastAsia="Courier New"/>
-          <w:sz w:val="24"/>
+          <w:rFonts w:ascii="Courier New" w:eastAsia="Courier New" w:hAnsi="Courier New"/>
+          <w:sz w:val="24"/>
+          <w:lang w:val="en-US"/>
         </w:rPr>
         <w:t xml:space="preserve">              &lt;&lt; arr_max(exchange_rate, n) &lt;&lt; '\n'</w:t>
       </w:r>
       <w:r>
+        <w:rPr>
+          <w:lang w:val="en-US"/>
+        </w:rPr>
         <w:br/>
       </w:r>
       <w:r>
         <w:rPr>
-          <w:rFonts w:ascii="Courier New" w:hAnsi="Courier New" w:eastAsia="Courier New"/>
-          <w:sz w:val="24"/>
-        </w:rPr>
-        <w:t xml:space="preserve">              &lt;&lt; "Средний курс: " &lt;&lt; std::fixed</w:t>
-      </w:r>
-      <w:r>
+          <w:rFonts w:ascii="Courier New" w:eastAsia="Courier New" w:hAnsi="Courier New"/>
+          <w:sz w:val="24"/>
+          <w:lang w:val="en-US"/>
+        </w:rPr>
+        <w:t xml:space="preserve">              &lt;&lt; "</w:t>
+      </w:r>
+      <w:r>
+        <w:rPr>
+          <w:rFonts w:ascii="Courier New" w:eastAsia="Courier New" w:hAnsi="Courier New"/>
+          <w:sz w:val="24"/>
+        </w:rPr>
+        <w:t>Средний</w:t>
+      </w:r>
+      <w:r>
+        <w:rPr>
+          <w:rFonts w:ascii="Courier New" w:eastAsia="Courier New" w:hAnsi="Courier New"/>
+          <w:sz w:val="24"/>
+          <w:lang w:val="en-US"/>
+        </w:rPr>
+        <w:t xml:space="preserve"> </w:t>
+      </w:r>
+      <w:r>
+        <w:rPr>
+          <w:rFonts w:ascii="Courier New" w:eastAsia="Courier New" w:hAnsi="Courier New"/>
+          <w:sz w:val="24"/>
+        </w:rPr>
+        <w:t>курс</w:t>
+      </w:r>
+      <w:r>
+        <w:rPr>
+          <w:rFonts w:ascii="Courier New" w:eastAsia="Courier New" w:hAnsi="Courier New"/>
+          <w:sz w:val="24"/>
+          <w:lang w:val="en-US"/>
+        </w:rPr>
+        <w:t>: " &lt;&lt; std::fixed</w:t>
+      </w:r>
+      <w:r>
+        <w:rPr>
+          <w:lang w:val="en-US"/>
+        </w:rPr>
         <w:br/>
       </w:r>
       <w:r>
         <w:rPr>
-          <w:rFonts w:ascii="Courier New" w:hAnsi="Courier New" w:eastAsia="Courier New"/>
-          <w:sz w:val="24"/>
+          <w:rFonts w:ascii="Courier New" w:eastAsia="Courier New" w:hAnsi="Courier New"/>
+          <w:sz w:val="24"/>
+          <w:lang w:val="en-US"/>
         </w:rPr>
         <w:t xml:space="preserve">              &lt;&lt; std::setprecision(2)</w:t>
       </w:r>
       <w:r>
+        <w:rPr>
+          <w:lang w:val="en-US"/>
+        </w:rPr>
         <w:br/>
       </w:r>
       <w:r>
         <w:rPr>
-          <w:rFonts w:ascii="Courier New" w:hAnsi="Courier New" w:eastAsia="Courier New"/>
-          <w:sz w:val="24"/>
+          <w:rFonts w:ascii="Courier New" w:eastAsia="Courier New" w:hAnsi="Courier New"/>
+          <w:sz w:val="24"/>
+          <w:lang w:val="en-US"/>
         </w:rPr>
         <w:t xml:space="preserve">              &lt;&lt; arr_average(exchange_rate, n) &lt;&lt; '\n'</w:t>
       </w:r>
       <w:r>
+        <w:rPr>
+          <w:lang w:val="en-US"/>
+        </w:rPr>
         <w:br/>
       </w:r>
       <w:r>
         <w:rPr>
-          <w:rFonts w:ascii="Courier New" w:hAnsi="Courier New" w:eastAsia="Courier New"/>
-          <w:sz w:val="24"/>
-        </w:rPr>
-        <w:t xml:space="preserve">              &lt;&lt; "Медиана: "</w:t>
-      </w:r>
-      <w:r>
+          <w:rFonts w:ascii="Courier New" w:eastAsia="Courier New" w:hAnsi="Courier New"/>
+          <w:sz w:val="24"/>
+          <w:lang w:val="en-US"/>
+        </w:rPr>
+        <w:t xml:space="preserve">              &lt;&lt; "</w:t>
+      </w:r>
+      <w:r>
+        <w:rPr>
+          <w:rFonts w:ascii="Courier New" w:eastAsia="Courier New" w:hAnsi="Courier New"/>
+          <w:sz w:val="24"/>
+        </w:rPr>
+        <w:t>Медиана</w:t>
+      </w:r>
+      <w:r>
+        <w:rPr>
+          <w:rFonts w:ascii="Courier New" w:eastAsia="Courier New" w:hAnsi="Courier New"/>
+          <w:sz w:val="24"/>
+          <w:lang w:val="en-US"/>
+        </w:rPr>
+        <w:t>: "</w:t>
+      </w:r>
+      <w:r>
+        <w:rPr>
+          <w:lang w:val="en-US"/>
+        </w:rPr>
         <w:br/>
       </w:r>
       <w:r>
         <w:rPr>
-          <w:rFonts w:ascii="Courier New" w:hAnsi="Courier New" w:eastAsia="Courier New"/>
-          <w:sz w:val="24"/>
+          <w:rFonts w:ascii="Courier New" w:eastAsia="Courier New" w:hAnsi="Courier New"/>
+          <w:sz w:val="24"/>
+          <w:lang w:val="en-US"/>
         </w:rPr>
         <w:t xml:space="preserve">              &lt;&lt; arr_median(exchange_rate, n) &lt;&lt; '\n'</w:t>
       </w:r>
       <w:r>
+        <w:rPr>
+          <w:lang w:val="en-US"/>
+        </w:rPr>
         <w:br/>
       </w:r>
       <w:r>
         <w:rPr>
-          <w:rFonts w:ascii="Courier New" w:hAnsi="Courier New" w:eastAsia="Courier New"/>
-          <w:sz w:val="24"/>
-        </w:rPr>
-        <w:t xml:space="preserve">              &lt;&lt; "Дней с курсом выше 93: "</w:t>
-      </w:r>
-      <w:r>
+          <w:rFonts w:ascii="Courier New" w:eastAsia="Courier New" w:hAnsi="Courier New"/>
+          <w:sz w:val="24"/>
+          <w:lang w:val="en-US"/>
+        </w:rPr>
+        <w:t xml:space="preserve">              &lt;&lt; "</w:t>
+      </w:r>
+      <w:r>
+        <w:rPr>
+          <w:rFonts w:ascii="Courier New" w:eastAsia="Courier New" w:hAnsi="Courier New"/>
+          <w:sz w:val="24"/>
+        </w:rPr>
+        <w:t>Дней</w:t>
+      </w:r>
+      <w:r>
+        <w:rPr>
+          <w:rFonts w:ascii="Courier New" w:eastAsia="Courier New" w:hAnsi="Courier New"/>
+          <w:sz w:val="24"/>
+          <w:lang w:val="en-US"/>
+        </w:rPr>
+        <w:t xml:space="preserve"> </w:t>
+      </w:r>
+      <w:r>
+        <w:rPr>
+          <w:rFonts w:ascii="Courier New" w:eastAsia="Courier New" w:hAnsi="Courier New"/>
+          <w:sz w:val="24"/>
+        </w:rPr>
+        <w:t>с</w:t>
+      </w:r>
+      <w:r>
+        <w:rPr>
+          <w:rFonts w:ascii="Courier New" w:eastAsia="Courier New" w:hAnsi="Courier New"/>
+          <w:sz w:val="24"/>
+          <w:lang w:val="en-US"/>
+        </w:rPr>
+        <w:t xml:space="preserve"> </w:t>
+      </w:r>
+      <w:r>
+        <w:rPr>
+          <w:rFonts w:ascii="Courier New" w:eastAsia="Courier New" w:hAnsi="Courier New"/>
+          <w:sz w:val="24"/>
+        </w:rPr>
+        <w:t>курсом</w:t>
+      </w:r>
+      <w:r>
+        <w:rPr>
+          <w:rFonts w:ascii="Courier New" w:eastAsia="Courier New" w:hAnsi="Courier New"/>
+          <w:sz w:val="24"/>
+          <w:lang w:val="en-US"/>
+        </w:rPr>
+        <w:t xml:space="preserve"> </w:t>
+      </w:r>
+      <w:r>
+        <w:rPr>
+          <w:rFonts w:ascii="Courier New" w:eastAsia="Courier New" w:hAnsi="Courier New"/>
+          <w:sz w:val="24"/>
+        </w:rPr>
+        <w:t>выше</w:t>
+      </w:r>
+      <w:r>
+        <w:rPr>
+          <w:rFonts w:ascii="Courier New" w:eastAsia="Courier New" w:hAnsi="Courier New"/>
+          <w:sz w:val="24"/>
+          <w:lang w:val="en-US"/>
+        </w:rPr>
+        <w:t xml:space="preserve"> 93: "</w:t>
+      </w:r>
+      <w:r>
+        <w:rPr>
+          <w:lang w:val="en-US"/>
+        </w:rPr>
         <w:br/>
       </w:r>
       <w:r>
         <w:rPr>
-          <w:rFonts w:ascii="Courier New" w:hAnsi="Courier New" w:eastAsia="Courier New"/>
-          <w:sz w:val="24"/>
+          <w:rFonts w:ascii="Courier New" w:eastAsia="Courier New" w:hAnsi="Courier New"/>
+          <w:sz w:val="24"/>
+          <w:lang w:val="en-US"/>
         </w:rPr>
         <w:t xml:space="preserve">              &lt;&lt; days_above_93 &lt;&lt; '\n';</w:t>
       </w:r>
       <w:r>
+        <w:rPr>
+          <w:lang w:val="en-US"/>
+        </w:rPr>
         <w:br/>
       </w:r>
       <w:r>
         <w:rPr>
-          <w:rFonts w:ascii="Courier New" w:hAnsi="Courier New" w:eastAsia="Courier New"/>
-          <w:sz w:val="24"/>
+          <w:rFonts w:ascii="Courier New" w:eastAsia="Courier New" w:hAnsi="Courier New"/>
+          <w:sz w:val="24"/>
+          <w:lang w:val="en-US"/>
         </w:rPr>
         <w:t xml:space="preserve">    return 0;</w:t>
       </w:r>
       <w:r>
+        <w:rPr>
+          <w:lang w:val="en-US"/>
+        </w:rPr>
         <w:br/>
       </w:r>
       <w:r>
         <w:rPr>
-          <w:rFonts w:ascii="Courier New" w:hAnsi="Courier New" w:eastAsia="Courier New"/>
-          <w:sz w:val="24"/>
+          <w:rFonts w:ascii="Courier New" w:eastAsia="Courier New" w:hAnsi="Courier New"/>
+          <w:sz w:val="24"/>
+          <w:lang w:val="en-US"/>
         </w:rPr>
         <w:t>}</w:t>
       </w:r>
     </w:p>
     <w:p>
       <w:pPr>
-        <w:ind w:firstLine="0"/>
-      </w:pPr>
-      <w:r>
+        <w:rPr>
+          <w:lang w:val="en-US"/>
+        </w:rPr>
+      </w:pPr>
+      <w:r>
+        <w:rPr>
+          <w:lang w:val="en-US"/>
+        </w:rPr>
         <w:br w:type="page"/>
       </w:r>
     </w:p>
     <w:p>
       <w:pPr>
-        <w:spacing w:line="240" w:lineRule="auto"/>
-        <w:ind w:firstLine="0"/>
         <w:jc w:val="center"/>
       </w:pPr>
       <w:r>
         <w:rPr>
-          <w:rFonts w:ascii="Times New Roman" w:hAnsi="Times New Roman" w:eastAsia="Times New Roman"/>
           <w:b/>
           <w:sz w:val="28"/>
         </w:rPr>
+        <w:lastRenderedPageBreak/>
         <w:t>ПРИЛОЖЕНИЕ Б</w:t>
       </w:r>
     </w:p>
     <w:p>
       <w:pPr>
-        <w:spacing w:line="240" w:lineRule="auto"/>
-        <w:ind w:firstLine="0"/>
         <w:jc w:val="center"/>
       </w:pPr>
       <w:r>
         <w:rPr>
-          <w:rFonts w:ascii="Times New Roman" w:hAnsi="Times New Roman" w:eastAsia="Times New Roman"/>
           <w:b/>
           <w:sz w:val="28"/>
         </w:rPr>
@@ -3569,13 +3775,11 @@
     </w:p>
     <w:p>
       <w:pPr>
-        <w:spacing w:line="360" w:lineRule="auto" w:after="0"/>
-        <w:ind w:firstLine="0"/>
+        <w:spacing w:line="360" w:lineRule="auto"/>
         <w:jc w:val="both"/>
       </w:pPr>
       <w:r>
         <w:rPr>
-          <w:rFonts w:ascii="Times New Roman" w:hAnsi="Times New Roman" w:eastAsia="Times New Roman"/>
           <w:sz w:val="24"/>
         </w:rPr>
         <w:t>Схема показывает проверку массива, подсчёт дней с курсом выше 93 и вывод результатов.</w:t>
@@ -3583,27 +3787,29 @@
     </w:p>
     <w:p>
       <w:pPr>
-        <w:spacing w:line="240" w:lineRule="auto" w:before="0" w:after="0"/>
-        <w:ind w:firstLine="0"/>
         <w:jc w:val="center"/>
       </w:pPr>
       <w:r>
+        <w:rPr>
+          <w:noProof/>
+        </w:rPr>
         <w:drawing>
-          <wp:inline xmlns:a="http://schemas.openxmlformats.org/drawingml/2006/main" xmlns:pic="http://schemas.openxmlformats.org/drawingml/2006/picture">
+          <wp:inline distT="0" distB="0" distL="0" distR="0" wp14:anchorId="7998CB3F" wp14:editId="75BA34CE">
             <wp:extent cx="5688000" cy="7426000"/>
+            <wp:effectExtent l="0" t="0" r="0" b="0"/>
             <wp:docPr id="2110396741" name="Picture 2110396741"/>
             <wp:cNvGraphicFramePr>
-              <a:graphicFrameLocks noChangeAspect="1"/>
+              <a:graphicFrameLocks xmlns:a="http://schemas.openxmlformats.org/drawingml/2006/main" noChangeAspect="1"/>
             </wp:cNvGraphicFramePr>
-            <a:graphic>
+            <a:graphic xmlns:a="http://schemas.openxmlformats.org/drawingml/2006/main">
               <a:graphicData uri="http://schemas.openxmlformats.org/drawingml/2006/picture">
-                <pic:pic>
+                <pic:pic xmlns:pic="http://schemas.openxmlformats.org/drawingml/2006/picture">
                   <pic:nvPicPr>
                     <pic:cNvPr id="0" name="flowchart_variant_21.png"/>
                     <pic:cNvPicPr/>
                   </pic:nvPicPr>
                   <pic:blipFill>
-                    <a:blip r:embed="rId34"/>
+                    <a:blip r:embed="rId9"/>
                     <a:stretch>
                       <a:fillRect/>
                     </a:stretch>
@@ -3613,6 +3819,85 @@
                       <a:off x="0" y="0"/>
                       <a:ext cx="5688000" cy="7426000"/>
                     </a:xfrm>
+                    <a:prstGeom prst="rect">
+                      <a:avLst/>
+                    </a:prstGeom>
+                  </pic:spPr>
+                </pic:pic>
+              </a:graphicData>
+            </a:graphic>
+          </wp:inline>
+        </w:drawing>
+      </w:r>
+    </w:p>
+    <w:p>
+      <w:pPr>
+        <w:spacing w:before="60"/>
+        <w:jc w:val="center"/>
+      </w:pPr>
+      <w:r>
+        <w:rPr>
+          <w:sz w:val="24"/>
+        </w:rPr>
+        <w:t xml:space="preserve">Рисунок Б.1 — Блок-схема программы </w:t>
+      </w:r>
+    </w:p>
+    <w:p>
+      <w:pPr>
+        <w:pageBreakBefore/>
+        <w:jc w:val="center"/>
+      </w:pPr>
+      <w:r>
+        <w:rPr>
+          <w:b/>
+          <w:sz w:val="28"/>
+        </w:rPr>
+        <w:t>ПРИЛОЖЕНИЕ В</w:t>
+      </w:r>
+    </w:p>
+    <w:p>
+      <w:pPr>
+        <w:jc w:val="center"/>
+      </w:pPr>
+      <w:r>
+        <w:rPr>
+          <w:b/>
+          <w:sz w:val="28"/>
+        </w:rPr>
+        <w:t>Скриншоты выполнения команд</w:t>
+      </w:r>
+    </w:p>
+    <w:p>
+      <w:pPr>
+        <w:spacing w:before="100" w:after="0"/>
+        <w:jc w:val="center"/>
+      </w:pPr>
+      <w:r>
+        <w:drawing>
+          <wp:inline xmlns:a="http://schemas.openxmlformats.org/drawingml/2006/main" xmlns:pic="http://schemas.openxmlformats.org/drawingml/2006/picture">
+            <wp:extent cx="6126480" cy="1076274"/>
+            <wp:docPr id="2110396742" name="Picture 2110396742"/>
+            <wp:cNvGraphicFramePr>
+              <a:graphicFrameLocks noChangeAspect="1"/>
+            </wp:cNvGraphicFramePr>
+            <a:graphic>
+              <a:graphicData uri="http://schemas.openxmlformats.org/drawingml/2006/picture">
+                <pic:pic>
+                  <pic:nvPicPr>
+                    <pic:cNvPr id="0" name="terminal_01_configure.png"/>
+                    <pic:cNvPicPr/>
+                  </pic:nvPicPr>
+                  <pic:blipFill>
+                    <a:blip r:embed="rId14"/>
+                    <a:stretch>
+                      <a:fillRect/>
+                    </a:stretch>
+                  </pic:blipFill>
+                  <pic:spPr>
+                    <a:xfrm>
+                      <a:off x="0" y="0"/>
+                      <a:ext cx="6126480" cy="1076274"/>
+                    </a:xfrm>
                     <a:prstGeom prst="rect"/>
                   </pic:spPr>
                 </pic:pic>
@@ -3624,21 +3909,228 @@
     </w:p>
     <w:p>
       <w:pPr>
-        <w:spacing w:line="240" w:lineRule="auto" w:before="60" w:after="0"/>
-        <w:ind w:firstLine="0"/>
+        <w:spacing w:before="40" w:after="40"/>
         <w:jc w:val="center"/>
       </w:pPr>
       <w:r>
         <w:rPr>
-          <w:rFonts w:ascii="Times New Roman" w:hAnsi="Times New Roman" w:eastAsia="Times New Roman"/>
-          <w:sz w:val="24"/>
-        </w:rPr>
-        <w:t>Рисунок Б.1 — Блок-схема программы варианта 21</w:t>
+          <w:sz w:val="22"/>
+        </w:rPr>
+        <w:t>Рисунок В.1 — Настройка проекта CMake. Команда создаёт каталог build и подготавливает файлы для сборки.</w:t>
+      </w:r>
+    </w:p>
+    <w:p>
+      <w:pPr>
+        <w:spacing w:after="80"/>
+        <w:ind w:firstLine="706"/>
+        <w:jc w:val="both"/>
+      </w:pPr>
+      <w:r>
+        <w:rPr>
+          <w:sz w:val="24"/>
+        </w:rPr>
+        <w:t>Команда настраивает проект и генерирует файлы, необходимые CMake для компиляции.</w:t>
+      </w:r>
+    </w:p>
+    <w:p>
+      <w:pPr>
+        <w:spacing w:before="100" w:after="0"/>
+        <w:jc w:val="center"/>
+      </w:pPr>
+      <w:r>
+        <w:drawing>
+          <wp:inline xmlns:a="http://schemas.openxmlformats.org/drawingml/2006/main" xmlns:pic="http://schemas.openxmlformats.org/drawingml/2006/picture">
+            <wp:extent cx="6126480" cy="1535760"/>
+            <wp:docPr id="2110396743" name="Picture 2110396743"/>
+            <wp:cNvGraphicFramePr>
+              <a:graphicFrameLocks noChangeAspect="1"/>
+            </wp:cNvGraphicFramePr>
+            <a:graphic>
+              <a:graphicData uri="http://schemas.openxmlformats.org/drawingml/2006/picture">
+                <pic:pic>
+                  <pic:nvPicPr>
+                    <pic:cNvPr id="0" name="terminal_02_build.png"/>
+                    <pic:cNvPicPr/>
+                  </pic:nvPicPr>
+                  <pic:blipFill>
+                    <a:blip r:embed="rId15"/>
+                    <a:stretch>
+                      <a:fillRect/>
+                    </a:stretch>
+                  </pic:blipFill>
+                  <pic:spPr>
+                    <a:xfrm>
+                      <a:off x="0" y="0"/>
+                      <a:ext cx="6126480" cy="1535760"/>
+                    </a:xfrm>
+                    <a:prstGeom prst="rect"/>
+                  </pic:spPr>
+                </pic:pic>
+              </a:graphicData>
+            </a:graphic>
+          </wp:inline>
+        </w:drawing>
+      </w:r>
+    </w:p>
+    <w:p>
+      <w:pPr>
+        <w:spacing w:before="40" w:after="40"/>
+        <w:jc w:val="center"/>
+      </w:pPr>
+      <w:r>
+        <w:rPr>
+          <w:sz w:val="22"/>
+        </w:rPr>
+        <w:t>Рисунок В.2 — Сборка проекта. Созданы статическая и динамическая библиотеки, приложения и тесты.</w:t>
+      </w:r>
+    </w:p>
+    <w:p>
+      <w:pPr>
+        <w:spacing w:after="80"/>
+        <w:ind w:firstLine="706"/>
+        <w:jc w:val="both"/>
+      </w:pPr>
+      <w:r>
+        <w:rPr>
+          <w:sz w:val="24"/>
+        </w:rPr>
+        <w:t>Сборка завершилась успешно: собраны обе версии библиотеки, программа варианта и две тестовые программы.</w:t>
+      </w:r>
+    </w:p>
+    <w:p>
+      <w:pPr>
+        <w:pageBreakBefore/>
+        <w:spacing w:before="100" w:after="0"/>
+        <w:jc w:val="center"/>
+      </w:pPr>
+      <w:r>
+        <w:drawing>
+          <wp:inline xmlns:a="http://schemas.openxmlformats.org/drawingml/2006/main" xmlns:pic="http://schemas.openxmlformats.org/drawingml/2006/picture">
+            <wp:extent cx="6126480" cy="1688922"/>
+            <wp:docPr id="2110396744" name="Picture 2110396744"/>
+            <wp:cNvGraphicFramePr>
+              <a:graphicFrameLocks noChangeAspect="1"/>
+            </wp:cNvGraphicFramePr>
+            <a:graphic>
+              <a:graphicData uri="http://schemas.openxmlformats.org/drawingml/2006/picture">
+                <pic:pic>
+                  <pic:nvPicPr>
+                    <pic:cNvPr id="0" name="terminal_03_tests.png"/>
+                    <pic:cNvPicPr/>
+                  </pic:nvPicPr>
+                  <pic:blipFill>
+                    <a:blip r:embed="rId16"/>
+                    <a:stretch>
+                      <a:fillRect/>
+                    </a:stretch>
+                  </pic:blipFill>
+                  <pic:spPr>
+                    <a:xfrm>
+                      <a:off x="0" y="0"/>
+                      <a:ext cx="6126480" cy="1688922"/>
+                    </a:xfrm>
+                    <a:prstGeom prst="rect"/>
+                  </pic:spPr>
+                </pic:pic>
+              </a:graphicData>
+            </a:graphic>
+          </wp:inline>
+        </w:drawing>
+      </w:r>
+    </w:p>
+    <w:p>
+      <w:pPr>
+        <w:spacing w:before="40" w:after="40"/>
+        <w:jc w:val="center"/>
+      </w:pPr>
+      <w:r>
+        <w:rPr>
+          <w:sz w:val="22"/>
+        </w:rPr>
+        <w:t>Рисунок В.3 — Запуск проверок CTest. Модульный и интеграционный тесты завершились успешно.</w:t>
+      </w:r>
+    </w:p>
+    <w:p>
+      <w:pPr>
+        <w:spacing w:after="80"/>
+        <w:ind w:firstLine="706"/>
+        <w:jc w:val="both"/>
+      </w:pPr>
+      <w:r>
+        <w:rPr>
+          <w:sz w:val="24"/>
+        </w:rPr>
+        <w:t>Обе проверки пройдены. Ошибок в результатах тестирования нет.</w:t>
+      </w:r>
+    </w:p>
+    <w:p>
+      <w:pPr>
+        <w:spacing w:before="100" w:after="0"/>
+        <w:jc w:val="center"/>
+      </w:pPr>
+      <w:r>
+        <w:drawing>
+          <wp:inline xmlns:a="http://schemas.openxmlformats.org/drawingml/2006/main" xmlns:pic="http://schemas.openxmlformats.org/drawingml/2006/picture">
+            <wp:extent cx="6126480" cy="1535760"/>
+            <wp:docPr id="2110396745" name="Picture 2110396745"/>
+            <wp:cNvGraphicFramePr>
+              <a:graphicFrameLocks noChangeAspect="1"/>
+            </wp:cNvGraphicFramePr>
+            <a:graphic>
+              <a:graphicData uri="http://schemas.openxmlformats.org/drawingml/2006/picture">
+                <pic:pic>
+                  <pic:nvPicPr>
+                    <pic:cNvPr id="0" name="terminal_04_variant21.png"/>
+                    <pic:cNvPicPr/>
+                  </pic:nvPicPr>
+                  <pic:blipFill>
+                    <a:blip r:embed="rId17"/>
+                    <a:stretch>
+                      <a:fillRect/>
+                    </a:stretch>
+                  </pic:blipFill>
+                  <pic:spPr>
+                    <a:xfrm>
+                      <a:off x="0" y="0"/>
+                      <a:ext cx="6126480" cy="1535760"/>
+                    </a:xfrm>
+                    <a:prstGeom prst="rect"/>
+                  </pic:spPr>
+                </pic:pic>
+              </a:graphicData>
+            </a:graphic>
+          </wp:inline>
+        </w:drawing>
+      </w:r>
+    </w:p>
+    <w:p>
+      <w:pPr>
+        <w:spacing w:before="40" w:after="40"/>
+        <w:jc w:val="center"/>
+      </w:pPr>
+      <w:r>
+        <w:rPr>
+          <w:sz w:val="22"/>
+        </w:rPr>
+        <w:t>Рисунок В.4 — Запуск программы варианта 21. Показаны значения курса и результаты вычислений.</w:t>
+      </w:r>
+    </w:p>
+    <w:p>
+      <w:pPr>
+        <w:spacing w:after="80"/>
+        <w:ind w:firstLine="706"/>
+        <w:jc w:val="both"/>
+      </w:pPr>
+      <w:r>
+        <w:rPr>
+          <w:sz w:val="24"/>
+        </w:rPr>
+        <w:t>Программа выводит исходный ряд курсов, минимум, максимум, среднее, медиану и количество дней с курсом выше 93.</w:t>
       </w:r>
     </w:p>
     <w:sectPr>
-      <w:footerReference w:type="even" r:id="rId30"/>
-      <w:footerReference w:type="default" r:id="rId31"/>
+      <w:footerReference w:type="even" r:id="rId10"/>
+      <w:footerReference w:type="default" r:id="rId11"/>
       <w:pgSz w:w="11906" w:h="16838"/>
       <w:pgMar w:top="851" w:right="567" w:bottom="851" w:left="1418" w:header="720" w:footer="720" w:gutter="0"/>
       <w:pgNumType w:start="1"/>
@@ -6872,6 +7364,7 @@
   <w:style w:type="character" w:default="1" w:styleId="a0">
     <w:name w:val="Default Paragraph Font"/>
     <w:uiPriority w:val="1"/>
+    <w:semiHidden/>
     <w:unhideWhenUsed/>
   </w:style>
   <w:style w:type="table" w:default="1" w:styleId="a1">

</xml_diff>